<commit_message>
Restructure investment portal and refresh 2026-07-10 research
</commit_message>
<xml_diff>
--- a/public/investor-downloads/daily-brief-2026-07-10.docx
+++ b/public/investor-downloads/daily-brief-2026-07-10.docx
@@ -8,7 +8,7 @@
       </w:pPr>
       <w:r>
         <w:rPr>
-          <w:rFonts w:ascii="Calibri" w:hAnsi="Calibri" w:eastAsia="Songti SC"/>
+          <w:rFonts w:ascii="Calibri" w:hAnsi="Calibri" w:eastAsia="Hiragino Sans GB"/>
           <w:b/>
           <w:i w:val="0"/>
           <w:color w:val="285B9D"/>
@@ -24,7 +24,7 @@
       </w:pPr>
       <w:r>
         <w:rPr>
-          <w:rFonts w:ascii="Calibri" w:hAnsi="Calibri" w:eastAsia="Songti SC"/>
+          <w:rFonts w:ascii="Calibri" w:hAnsi="Calibri" w:eastAsia="Hiragino Sans GB"/>
           <w:b w:val="0"/>
           <w:i w:val="0"/>
         </w:rPr>
@@ -38,7 +38,7 @@
       </w:pPr>
       <w:r>
         <w:rPr>
-          <w:rFonts w:ascii="Calibri" w:hAnsi="Calibri" w:eastAsia="Songti SC"/>
+          <w:rFonts w:ascii="Calibri" w:hAnsi="Calibri" w:eastAsia="Hiragino Sans GB"/>
           <w:b w:val="0"/>
           <w:i w:val="0"/>
         </w:rPr>
@@ -51,7 +51,7 @@
       </w:pPr>
       <w:r>
         <w:rPr>
-          <w:rFonts w:ascii="Calibri" w:hAnsi="Calibri" w:eastAsia="Songti SC"/>
+          <w:rFonts w:ascii="Calibri" w:hAnsi="Calibri" w:eastAsia="Hiragino Sans GB"/>
           <w:b/>
           <w:i w:val="0"/>
           <w:color w:val="0B2545"/>
@@ -66,13 +66,13 @@
       </w:pPr>
       <w:r>
         <w:rPr>
-          <w:rFonts w:ascii="Calibri" w:hAnsi="Calibri" w:eastAsia="Songti SC"/>
+          <w:rFonts w:ascii="Calibri" w:hAnsi="Calibri" w:eastAsia="Hiragino Sans GB"/>
           <w:b w:val="0"/>
           <w:i w:val="0"/>
           <w:color w:val="334155"/>
           <w:sz w:val="22"/>
         </w:rPr>
-        <w:t>2026-07-10 共纳入 31 篇中文研究结果，覆盖 2 位活跃分析师和 2 条主要行业链，较 2026-07-09 的主题变化可在右侧动量表中核对。简报优先呈现可被报告链接追溯的结论，而不是孤立摘要。</w:t>
+        <w:t>2026-07-10 共纳入 88 篇中文研究结果，覆盖 9 位活跃分析师和 5 条主要行业链，较 2026-07-09 的主题变化可在右侧动量表中核对。简报优先呈现可被报告链接追溯的结论，而不是孤立摘要。</w:t>
       </w:r>
     </w:p>
     <w:tbl>
@@ -101,7 +101,7 @@
             </w:pPr>
             <w:r>
               <w:rPr>
-                <w:rFonts w:ascii="Calibri" w:hAnsi="Calibri" w:eastAsia="Songti SC"/>
+                <w:rFonts w:ascii="Calibri" w:hAnsi="Calibri" w:eastAsia="Hiragino Sans GB"/>
                 <w:b/>
                 <w:color w:val="667085"/>
                 <w:sz w:val="17"/>
@@ -111,12 +111,12 @@
             </w:r>
             <w:r>
               <w:rPr>
-                <w:rFonts w:ascii="Calibri" w:hAnsi="Calibri" w:eastAsia="Songti SC"/>
+                <w:rFonts w:ascii="Calibri" w:hAnsi="Calibri" w:eastAsia="Hiragino Sans GB"/>
                 <w:b/>
                 <w:color w:val="285B9D"/>
                 <w:sz w:val="36"/>
               </w:rPr>
-              <w:t>31</w:t>
+              <w:t>88</w:t>
             </w:r>
           </w:p>
         </w:tc>
@@ -132,7 +132,7 @@
             </w:pPr>
             <w:r>
               <w:rPr>
-                <w:rFonts w:ascii="Calibri" w:hAnsi="Calibri" w:eastAsia="Songti SC"/>
+                <w:rFonts w:ascii="Calibri" w:hAnsi="Calibri" w:eastAsia="Hiragino Sans GB"/>
                 <w:b/>
                 <w:color w:val="667085"/>
                 <w:sz w:val="17"/>
@@ -142,12 +142,12 @@
             </w:r>
             <w:r>
               <w:rPr>
-                <w:rFonts w:ascii="Calibri" w:hAnsi="Calibri" w:eastAsia="Songti SC"/>
+                <w:rFonts w:ascii="Calibri" w:hAnsi="Calibri" w:eastAsia="Hiragino Sans GB"/>
                 <w:b/>
                 <w:color w:val="237A5B"/>
                 <w:sz w:val="36"/>
               </w:rPr>
-              <w:t>2</w:t>
+              <w:t>9</w:t>
             </w:r>
           </w:p>
         </w:tc>
@@ -163,7 +163,7 @@
             </w:pPr>
             <w:r>
               <w:rPr>
-                <w:rFonts w:ascii="Calibri" w:hAnsi="Calibri" w:eastAsia="Songti SC"/>
+                <w:rFonts w:ascii="Calibri" w:hAnsi="Calibri" w:eastAsia="Hiragino Sans GB"/>
                 <w:b/>
                 <w:color w:val="667085"/>
                 <w:sz w:val="17"/>
@@ -173,12 +173,12 @@
             </w:r>
             <w:r>
               <w:rPr>
-                <w:rFonts w:ascii="Calibri" w:hAnsi="Calibri" w:eastAsia="Songti SC"/>
+                <w:rFonts w:ascii="Calibri" w:hAnsi="Calibri" w:eastAsia="Hiragino Sans GB"/>
                 <w:b/>
                 <w:color w:val="A8731B"/>
                 <w:sz w:val="36"/>
               </w:rPr>
-              <w:t>2</w:t>
+              <w:t>5</w:t>
             </w:r>
           </w:p>
         </w:tc>
@@ -194,7 +194,7 @@
             </w:pPr>
             <w:r>
               <w:rPr>
-                <w:rFonts w:ascii="Calibri" w:hAnsi="Calibri" w:eastAsia="Songti SC"/>
+                <w:rFonts w:ascii="Calibri" w:hAnsi="Calibri" w:eastAsia="Hiragino Sans GB"/>
                 <w:b/>
                 <w:color w:val="667085"/>
                 <w:sz w:val="17"/>
@@ -204,7 +204,7 @@
             </w:r>
             <w:r>
               <w:rPr>
-                <w:rFonts w:ascii="Calibri" w:hAnsi="Calibri" w:eastAsia="Songti SC"/>
+                <w:rFonts w:ascii="Calibri" w:hAnsi="Calibri" w:eastAsia="Hiragino Sans GB"/>
                 <w:b/>
                 <w:color w:val="B43D49"/>
                 <w:sz w:val="36"/>
@@ -268,7 +268,7 @@
       </w:pPr>
       <w:r>
         <w:rPr>
-          <w:rFonts w:ascii="Calibri" w:hAnsi="Calibri" w:eastAsia="Songti SC"/>
+          <w:rFonts w:ascii="Calibri" w:hAnsi="Calibri" w:eastAsia="Hiragino Sans GB"/>
           <w:b w:val="0"/>
           <w:i/>
           <w:color w:val="667085"/>
@@ -292,7 +292,7 @@
       </w:pPr>
       <w:r>
         <w:rPr>
-          <w:rFonts w:ascii="Calibri" w:hAnsi="Calibri" w:eastAsia="Songti SC"/>
+          <w:rFonts w:ascii="Calibri" w:hAnsi="Calibri" w:eastAsia="Hiragino Sans GB"/>
           <w:b/>
           <w:color w:val="285B9D"/>
           <w:sz w:val="21"/>
@@ -304,9 +304,9 @@
           <w:rPr>
             <w:color w:val="285B9D"/>
             <w:u w:val="single"/>
-            <w:rFonts w:eastAsia="Songti SC" w:ascii="Calibri" w:hAnsi="Calibri"/>
+            <w:rFonts w:eastAsia="Hiragino Sans GB" w:ascii="Calibri" w:hAnsi="Calibri"/>
           </w:rPr>
-          <w:t>全球宏观专题报告：通胀路径验证、美联储反应函数与权益估值压力测试 是今日最高权重结论，核心证据来自 未识别，关联 宏观通胀传导。</w:t>
+          <w:t>前序研究研究报告 — 2026-07-10 是今日最高权重结论，核心证据来自 未识别，关联 AI 基础设施。</w:t>
         </w:r>
       </w:hyperlink>
     </w:p>
@@ -317,7 +317,7 @@
       </w:pPr>
       <w:r>
         <w:rPr>
-          <w:rFonts w:ascii="Calibri" w:hAnsi="Calibri" w:eastAsia="Songti SC"/>
+          <w:rFonts w:ascii="Calibri" w:hAnsi="Calibri" w:eastAsia="Hiragino Sans GB"/>
           <w:b/>
           <w:color w:val="285B9D"/>
           <w:sz w:val="21"/>
@@ -326,11 +326,11 @@
       </w:r>
       <w:r>
         <w:rPr>
-          <w:rFonts w:ascii="Calibri" w:hAnsi="Calibri" w:eastAsia="Songti SC"/>
+          <w:rFonts w:ascii="Calibri" w:hAnsi="Calibri" w:eastAsia="Hiragino Sans GB"/>
           <w:color w:val="111827"/>
           <w:sz w:val="21"/>
         </w:rPr>
-        <w:t>AI 今日 降温，当日计数 20，前一日计数 318。</w:t>
+        <w:t>AI 今日 降温，当日计数 71，前一日计数 323。</w:t>
       </w:r>
     </w:p>
     <w:p>
@@ -340,7 +340,7 @@
       </w:pPr>
       <w:r>
         <w:rPr>
-          <w:rFonts w:ascii="Calibri" w:hAnsi="Calibri" w:eastAsia="Songti SC"/>
+          <w:rFonts w:ascii="Calibri" w:hAnsi="Calibri" w:eastAsia="Hiragino Sans GB"/>
           <w:b/>
           <w:color w:val="285B9D"/>
           <w:sz w:val="21"/>
@@ -352,7 +352,7 @@
           <w:rPr>
             <w:color w:val="285B9D"/>
             <w:u w:val="single"/>
-            <w:rFonts w:eastAsia="Songti SC" w:ascii="Calibri" w:hAnsi="Calibri"/>
+            <w:rFonts w:eastAsia="Hiragino Sans GB" w:ascii="Calibri" w:hAnsi="Calibri"/>
           </w:rPr>
           <w:t>风险矩阵最需要跟踪的是 AI 基础设施：AI 算力开支刚性与北美变压器及并网物理瓶颈的估值博弈。</w:t>
         </w:r>
@@ -365,7 +365,7 @@
       </w:pPr>
       <w:r>
         <w:rPr>
-          <w:rFonts w:ascii="Calibri" w:hAnsi="Calibri" w:eastAsia="Songti SC"/>
+          <w:rFonts w:ascii="Calibri" w:hAnsi="Calibri" w:eastAsia="Hiragino Sans GB"/>
           <w:b/>
           <w:color w:val="285B9D"/>
           <w:sz w:val="21"/>
@@ -377,9 +377,9 @@
           <w:rPr>
             <w:color w:val="285B9D"/>
             <w:u w:val="single"/>
-            <w:rFonts w:eastAsia="Songti SC" w:ascii="Calibri" w:hAnsi="Calibri"/>
+            <w:rFonts w:eastAsia="Hiragino Sans GB" w:ascii="Calibri" w:hAnsi="Calibri"/>
           </w:rPr>
-          <w:t>宏观通胀传导 今日 31 条、近七日 1505 条，风险信号 1075 条。</w:t>
+          <w:t>宏观通胀传导 今日 83 条、近七日 1564 条，风险信号 1113 条。</w:t>
         </w:r>
       </w:hyperlink>
     </w:p>
@@ -403,7 +403,7 @@
           <w:p>
             <w:r>
               <w:rPr>
-                <w:rFonts w:ascii="Calibri" w:hAnsi="Calibri" w:eastAsia="Songti SC"/>
+                <w:rFonts w:ascii="Calibri" w:hAnsi="Calibri" w:eastAsia="Hiragino Sans GB"/>
                 <w:b/>
                 <w:color w:val="7A5A00"/>
                 <w:sz w:val="21"/>
@@ -412,7 +412,7 @@
             </w:r>
             <w:r>
               <w:rPr>
-                <w:rFonts w:ascii="Calibri" w:hAnsi="Calibri" w:eastAsia="Songti SC"/>
+                <w:rFonts w:ascii="Calibri" w:hAnsi="Calibri" w:eastAsia="Hiragino Sans GB"/>
                 <w:color w:val="7C2D12"/>
                 <w:sz w:val="21"/>
               </w:rPr>
@@ -483,7 +483,7 @@
       </w:pPr>
       <w:r>
         <w:rPr>
-          <w:rFonts w:ascii="Calibri" w:hAnsi="Calibri" w:eastAsia="Songti SC"/>
+          <w:rFonts w:ascii="Calibri" w:hAnsi="Calibri" w:eastAsia="Hiragino Sans GB"/>
           <w:b w:val="0"/>
           <w:i/>
           <w:color w:val="667085"/>
@@ -540,7 +540,7 @@
       </w:pPr>
       <w:r>
         <w:rPr>
-          <w:rFonts w:ascii="Calibri" w:hAnsi="Calibri" w:eastAsia="Songti SC"/>
+          <w:rFonts w:ascii="Calibri" w:hAnsi="Calibri" w:eastAsia="Hiragino Sans GB"/>
           <w:b w:val="0"/>
           <w:i/>
           <w:color w:val="667085"/>
@@ -602,7 +602,7 @@
       </w:pPr>
       <w:r>
         <w:rPr>
-          <w:rFonts w:ascii="Calibri" w:hAnsi="Calibri" w:eastAsia="Songti SC"/>
+          <w:rFonts w:ascii="Calibri" w:hAnsi="Calibri" w:eastAsia="Hiragino Sans GB"/>
           <w:b w:val="0"/>
           <w:i/>
           <w:color w:val="667085"/>
@@ -664,7 +664,7 @@
       </w:pPr>
       <w:r>
         <w:rPr>
-          <w:rFonts w:ascii="Calibri" w:hAnsi="Calibri" w:eastAsia="Songti SC"/>
+          <w:rFonts w:ascii="Calibri" w:hAnsi="Calibri" w:eastAsia="Hiragino Sans GB"/>
           <w:b w:val="0"/>
           <w:i/>
           <w:color w:val="667085"/>
@@ -687,13 +687,13 @@
       </w:pPr>
       <w:r>
         <w:rPr>
-          <w:rFonts w:ascii="Calibri" w:hAnsi="Calibri" w:eastAsia="Songti SC"/>
+          <w:rFonts w:ascii="Calibri" w:hAnsi="Calibri" w:eastAsia="Hiragino Sans GB"/>
           <w:b/>
           <w:i w:val="0"/>
           <w:color w:val="0B2545"/>
           <w:sz w:val="23"/>
         </w:rPr>
-        <w:t>1. 全球宏观专题报告：通胀路径验证、美联储反应函数与权益估值压力测试</w:t>
+        <w:t>1. 前序研究研究报告 — 2026-07-10</w:t>
       </w:r>
     </w:p>
     <w:p>
@@ -702,7 +702,287 @@
       </w:pPr>
       <w:r>
         <w:rPr>
-          <w:rFonts w:ascii="Calibri" w:hAnsi="Calibri" w:eastAsia="Songti SC"/>
+          <w:rFonts w:ascii="Calibri" w:hAnsi="Calibri" w:eastAsia="Hiragino Sans GB"/>
+          <w:b w:val="0"/>
+          <w:i w:val="0"/>
+          <w:color w:val="667085"/>
+          <w:sz w:val="17"/>
+        </w:rPr>
+        <w:t>未识别 · AI 基础设施 · score 54.4</w:t>
+      </w:r>
+    </w:p>
+    <w:p>
+      <w:pPr>
+        <w:spacing w:before="0" w:after="100" w:line="264" w:lineRule="auto"/>
+      </w:pPr>
+      <w:r>
+        <w:rPr>
+          <w:rFonts w:ascii="Calibri" w:hAnsi="Calibri" w:eastAsia="Hiragino Sans GB"/>
+          <w:b w:val="0"/>
+          <w:i w:val="0"/>
+          <w:color w:val="334155"/>
+          <w:sz w:val="20"/>
+        </w:rPr>
+        <w:t>截至研究所工作日 2026-07-10，我对前序链条采取 综合 而非推翻：AI Capex 周期的需求韧性仍在，但可投资瓶颈已从“谁买 GPU”迁移到“谁掌握可交付电力、电网设备与抗通胀实物投入”。这支持研...</w:t>
+      </w:r>
+    </w:p>
+    <w:p>
+      <w:pPr>
+        <w:spacing w:before="0" w:after="160" w:line="264" w:lineRule="auto"/>
+      </w:pPr>
+      <w:r>
+        <w:rPr>
+          <w:rFonts w:ascii="Calibri" w:hAnsi="Calibri" w:eastAsia="Hiragino Sans GB"/>
+          <w:b w:val="0"/>
+          <w:i w:val="0"/>
+          <w:color w:val="667085"/>
+          <w:sz w:val="17"/>
+        </w:rPr>
+        <w:t xml:space="preserve">Report: </w:t>
+      </w:r>
+      <w:hyperlink r:id="rId12">
+        <w:r>
+          <w:rPr>
+            <w:color w:val="285B9D"/>
+            <w:u w:val="single"/>
+            <w:rFonts w:eastAsia="Hiragino Sans GB" w:ascii="Calibri" w:hAnsi="Calibri"/>
+          </w:rPr>
+          <w:t>reports/archive-ce309bb0c3fe</w:t>
+        </w:r>
+      </w:hyperlink>
+    </w:p>
+    <w:p>
+      <w:pPr>
+        <w:spacing w:before="0" w:after="40" w:line="264" w:lineRule="auto"/>
+      </w:pPr>
+      <w:r>
+        <w:rPr>
+          <w:rFonts w:ascii="Calibri" w:hAnsi="Calibri" w:eastAsia="Hiragino Sans GB"/>
+          <w:b/>
+          <w:i w:val="0"/>
+          <w:color w:val="0B2545"/>
+          <w:sz w:val="23"/>
+        </w:rPr>
+        <w:t>2. 能源与利率成本双重挤压：AI 算力基础设施的 Capex 韧性</w:t>
+      </w:r>
+    </w:p>
+    <w:p>
+      <w:pPr>
+        <w:spacing w:before="0" w:after="40" w:line="264" w:lineRule="auto"/>
+      </w:pPr>
+      <w:r>
+        <w:rPr>
+          <w:rFonts w:ascii="Calibri" w:hAnsi="Calibri" w:eastAsia="Hiragino Sans GB"/>
+          <w:b w:val="0"/>
+          <w:i w:val="0"/>
+          <w:color w:val="667085"/>
+          <w:sz w:val="17"/>
+        </w:rPr>
+        <w:t>未识别 · AI 基础设施 · score 47.0</w:t>
+      </w:r>
+    </w:p>
+    <w:p>
+      <w:pPr>
+        <w:spacing w:before="0" w:after="100" w:line="264" w:lineRule="auto"/>
+      </w:pPr>
+      <w:r>
+        <w:rPr>
+          <w:rFonts w:ascii="Calibri" w:hAnsi="Calibri" w:eastAsia="Hiragino Sans GB"/>
+          <w:b w:val="0"/>
+          <w:i w:val="0"/>
+          <w:color w:val="334155"/>
+          <w:sz w:val="20"/>
+        </w:rPr>
+        <w:t>研究记录 · AI 基础设施分析师 · 工作日期：2026-07-10（亚洲/新加坡） 立场： stress-test（压力测试）· 关联机构观点： th T01、th T11、th p cfd084a4</w:t>
+      </w:r>
+    </w:p>
+    <w:p>
+      <w:pPr>
+        <w:spacing w:before="0" w:after="160" w:line="264" w:lineRule="auto"/>
+      </w:pPr>
+      <w:r>
+        <w:rPr>
+          <w:rFonts w:ascii="Calibri" w:hAnsi="Calibri" w:eastAsia="Hiragino Sans GB"/>
+          <w:b w:val="0"/>
+          <w:i w:val="0"/>
+          <w:color w:val="667085"/>
+          <w:sz w:val="17"/>
+        </w:rPr>
+        <w:t xml:space="preserve">Report: </w:t>
+      </w:r>
+      <w:hyperlink r:id="rId19">
+        <w:r>
+          <w:rPr>
+            <w:color w:val="285B9D"/>
+            <w:u w:val="single"/>
+            <w:rFonts w:eastAsia="Hiragino Sans GB" w:ascii="Calibri" w:hAnsi="Calibri"/>
+          </w:rPr>
+          <w:t>reports/archive-ac86840616ac</w:t>
+        </w:r>
+      </w:hyperlink>
+    </w:p>
+    <w:p>
+      <w:pPr>
+        <w:spacing w:before="0" w:after="40" w:line="264" w:lineRule="auto"/>
+      </w:pPr>
+      <w:r>
+        <w:rPr>
+          <w:rFonts w:ascii="Calibri" w:hAnsi="Calibri" w:eastAsia="Hiragino Sans GB"/>
+          <w:b/>
+          <w:i w:val="0"/>
+          <w:color w:val="0B2545"/>
+          <w:sz w:val="23"/>
+        </w:rPr>
+        <w:t>3. 公用事业压力测试：电网接入、变压器、调峰电源与绿电交易能否支撑2026–2027年智算扩张？</w:t>
+      </w:r>
+    </w:p>
+    <w:p>
+      <w:pPr>
+        <w:spacing w:before="0" w:after="40" w:line="264" w:lineRule="auto"/>
+      </w:pPr>
+      <w:r>
+        <w:rPr>
+          <w:rFonts w:ascii="Calibri" w:hAnsi="Calibri" w:eastAsia="Hiragino Sans GB"/>
+          <w:b w:val="0"/>
+          <w:i w:val="0"/>
+          <w:color w:val="667085"/>
+          <w:sz w:val="17"/>
+        </w:rPr>
+        <w:t>未识别 · 电力与电网 · score 47.0</w:t>
+      </w:r>
+    </w:p>
+    <w:p>
+      <w:pPr>
+        <w:spacing w:before="0" w:after="100" w:line="264" w:lineRule="auto"/>
+      </w:pPr>
+      <w:r>
+        <w:rPr>
+          <w:rFonts w:ascii="Calibri" w:hAnsi="Calibri" w:eastAsia="Hiragino Sans GB"/>
+          <w:b w:val="0"/>
+          <w:i w:val="0"/>
+          <w:color w:val="334155"/>
+          <w:sz w:val="20"/>
+        </w:rPr>
+        <w:t>公用事业压力测试：电网接入、变压器、调峰电源与绿电交易能否支撑2026–2027年智算扩张？</w:t>
+      </w:r>
+    </w:p>
+    <w:p>
+      <w:pPr>
+        <w:spacing w:before="0" w:after="160" w:line="264" w:lineRule="auto"/>
+      </w:pPr>
+      <w:r>
+        <w:rPr>
+          <w:rFonts w:ascii="Calibri" w:hAnsi="Calibri" w:eastAsia="Hiragino Sans GB"/>
+          <w:b w:val="0"/>
+          <w:i w:val="0"/>
+          <w:color w:val="667085"/>
+          <w:sz w:val="17"/>
+        </w:rPr>
+        <w:t xml:space="preserve">Report: </w:t>
+      </w:r>
+      <w:hyperlink r:id="rId20">
+        <w:r>
+          <w:rPr>
+            <w:color w:val="285B9D"/>
+            <w:u w:val="single"/>
+            <w:rFonts w:eastAsia="Hiragino Sans GB" w:ascii="Calibri" w:hAnsi="Calibri"/>
+          </w:rPr>
+          <w:t>reports/archive-5de3cbdda63c</w:t>
+        </w:r>
+      </w:hyperlink>
+    </w:p>
+    <w:p>
+      <w:pPr>
+        <w:spacing w:before="0" w:after="40" w:line="264" w:lineRule="auto"/>
+      </w:pPr>
+      <w:r>
+        <w:rPr>
+          <w:rFonts w:ascii="Calibri" w:hAnsi="Calibri" w:eastAsia="Hiragino Sans GB"/>
+          <w:b/>
+          <w:i w:val="0"/>
+          <w:color w:val="0B2545"/>
+          <w:sz w:val="23"/>
+        </w:rPr>
+        <w:t>4. 压力测试：电力设备与温控出海链的机构筹码拥挤度 vs. 估值安全边际</w:t>
+      </w:r>
+    </w:p>
+    <w:p>
+      <w:pPr>
+        <w:spacing w:before="0" w:after="40" w:line="264" w:lineRule="auto"/>
+      </w:pPr>
+      <w:r>
+        <w:rPr>
+          <w:rFonts w:ascii="Calibri" w:hAnsi="Calibri" w:eastAsia="Hiragino Sans GB"/>
+          <w:b w:val="0"/>
+          <w:i w:val="0"/>
+          <w:color w:val="667085"/>
+          <w:sz w:val="17"/>
+        </w:rPr>
+        <w:t>未识别 · 宏观通胀传导 · score 45.2</w:t>
+      </w:r>
+    </w:p>
+    <w:p>
+      <w:pPr>
+        <w:spacing w:before="0" w:after="100" w:line="264" w:lineRule="auto"/>
+      </w:pPr>
+      <w:r>
+        <w:rPr>
+          <w:rFonts w:ascii="Calibri" w:hAnsi="Calibri" w:eastAsia="Hiragino Sans GB"/>
+          <w:b w:val="0"/>
+          <w:i w:val="0"/>
+          <w:color w:val="334155"/>
+          <w:sz w:val="20"/>
+        </w:rPr>
+        <w:t>研究记录 · 分析师： 首席策略师 · 立场： 压力测试（stress-test） - 工作日： 2026-07-10（Asia/Singapore） · 根议题： A股硬科技——结构性切换还是拥挤反弹 - 问题： 在资金重配电力设...</w:t>
+      </w:r>
+    </w:p>
+    <w:p>
+      <w:pPr>
+        <w:spacing w:before="0" w:after="160" w:line="264" w:lineRule="auto"/>
+      </w:pPr>
+      <w:r>
+        <w:rPr>
+          <w:rFonts w:ascii="Calibri" w:hAnsi="Calibri" w:eastAsia="Hiragino Sans GB"/>
+          <w:b w:val="0"/>
+          <w:i w:val="0"/>
+          <w:color w:val="667085"/>
+          <w:sz w:val="17"/>
+        </w:rPr>
+        <w:t xml:space="preserve">Report: </w:t>
+      </w:r>
+      <w:hyperlink r:id="rId21">
+        <w:r>
+          <w:rPr>
+            <w:color w:val="285B9D"/>
+            <w:u w:val="single"/>
+            <w:rFonts w:eastAsia="Hiragino Sans GB" w:ascii="Calibri" w:hAnsi="Calibri"/>
+          </w:rPr>
+          <w:t>reports/archive-103f5b3a2942</w:t>
+        </w:r>
+      </w:hyperlink>
+    </w:p>
+    <w:p>
+      <w:pPr>
+        <w:spacing w:before="0" w:after="40" w:line="264" w:lineRule="auto"/>
+      </w:pPr>
+      <w:r>
+        <w:rPr>
+          <w:rFonts w:ascii="Calibri" w:hAnsi="Calibri" w:eastAsia="Hiragino Sans GB"/>
+          <w:b/>
+          <w:i w:val="0"/>
+          <w:color w:val="0B2545"/>
+          <w:sz w:val="23"/>
+        </w:rPr>
+        <w:t>5. 全球宏观专题报告：通胀路径验证、美联储反应函数与权益估值压力测试</w:t>
+      </w:r>
+    </w:p>
+    <w:p>
+      <w:pPr>
+        <w:spacing w:before="0" w:after="40" w:line="264" w:lineRule="auto"/>
+      </w:pPr>
+      <w:r>
+        <w:rPr>
+          <w:rFonts w:ascii="Calibri" w:hAnsi="Calibri" w:eastAsia="Hiragino Sans GB"/>
           <w:b w:val="0"/>
           <w:i w:val="0"/>
           <w:color w:val="667085"/>
@@ -717,7 +997,7 @@
       </w:pPr>
       <w:r>
         <w:rPr>
-          <w:rFonts w:ascii="Calibri" w:hAnsi="Calibri" w:eastAsia="Songti SC"/>
+          <w:rFonts w:ascii="Calibri" w:hAnsi="Calibri" w:eastAsia="Hiragino Sans GB"/>
           <w:b w:val="0"/>
           <w:i w:val="0"/>
           <w:color w:val="334155"/>
@@ -732,7 +1012,7 @@
       </w:pPr>
       <w:r>
         <w:rPr>
-          <w:rFonts w:ascii="Calibri" w:hAnsi="Calibri" w:eastAsia="Songti SC"/>
+          <w:rFonts w:ascii="Calibri" w:hAnsi="Calibri" w:eastAsia="Hiragino Sans GB"/>
           <w:b w:val="0"/>
           <w:i w:val="0"/>
           <w:color w:val="667085"/>
@@ -740,12 +1020,12 @@
         </w:rPr>
         <w:t xml:space="preserve">Report: </w:t>
       </w:r>
-      <w:hyperlink r:id="rId12">
+      <w:hyperlink r:id="rId22">
         <w:r>
           <w:rPr>
             <w:color w:val="285B9D"/>
             <w:u w:val="single"/>
-            <w:rFonts w:eastAsia="Songti SC" w:ascii="Calibri" w:hAnsi="Calibri"/>
+            <w:rFonts w:eastAsia="Hiragino Sans GB" w:ascii="Calibri" w:hAnsi="Calibri"/>
           </w:rPr>
           <w:t>reports/archive-c7f866e26396</w:t>
         </w:r>
@@ -757,13 +1037,13 @@
       </w:pPr>
       <w:r>
         <w:rPr>
-          <w:rFonts w:ascii="Calibri" w:hAnsi="Calibri" w:eastAsia="Songti SC"/>
+          <w:rFonts w:ascii="Calibri" w:hAnsi="Calibri" w:eastAsia="Hiragino Sans GB"/>
           <w:b/>
           <w:i w:val="0"/>
           <w:color w:val="0B2545"/>
           <w:sz w:val="23"/>
         </w:rPr>
-        <w:t>2. 把央行流动性时钟转化为红利腿与组合风险预算的最终权重报告</w:t>
+        <w:t>6. 把央行流动性时钟转化为红利腿与组合风险预算的最终权重报告</w:t>
       </w:r>
     </w:p>
     <w:p>
@@ -772,7 +1052,7 @@
       </w:pPr>
       <w:r>
         <w:rPr>
-          <w:rFonts w:ascii="Calibri" w:hAnsi="Calibri" w:eastAsia="Songti SC"/>
+          <w:rFonts w:ascii="Calibri" w:hAnsi="Calibri" w:eastAsia="Hiragino Sans GB"/>
           <w:b w:val="0"/>
           <w:i w:val="0"/>
           <w:color w:val="667085"/>
@@ -787,7 +1067,7 @@
       </w:pPr>
       <w:r>
         <w:rPr>
-          <w:rFonts w:ascii="Calibri" w:hAnsi="Calibri" w:eastAsia="Songti SC"/>
+          <w:rFonts w:ascii="Calibri" w:hAnsi="Calibri" w:eastAsia="Hiragino Sans GB"/>
           <w:b w:val="0"/>
           <w:i w:val="0"/>
           <w:color w:val="334155"/>
@@ -802,7 +1082,7 @@
       </w:pPr>
       <w:r>
         <w:rPr>
-          <w:rFonts w:ascii="Calibri" w:hAnsi="Calibri" w:eastAsia="Songti SC"/>
+          <w:rFonts w:ascii="Calibri" w:hAnsi="Calibri" w:eastAsia="Hiragino Sans GB"/>
           <w:b w:val="0"/>
           <w:i w:val="0"/>
           <w:color w:val="667085"/>
@@ -810,294 +1090,14 @@
         </w:rPr>
         <w:t xml:space="preserve">Report: </w:t>
       </w:r>
-      <w:hyperlink r:id="rId19">
+      <w:hyperlink r:id="rId23">
         <w:r>
           <w:rPr>
             <w:color w:val="285B9D"/>
             <w:u w:val="single"/>
-            <w:rFonts w:eastAsia="Songti SC" w:ascii="Calibri" w:hAnsi="Calibri"/>
+            <w:rFonts w:eastAsia="Hiragino Sans GB" w:ascii="Calibri" w:hAnsi="Calibri"/>
           </w:rPr>
           <w:t>reports/archive-ccb12ffcda68</w:t>
-        </w:r>
-      </w:hyperlink>
-    </w:p>
-    <w:p>
-      <w:pPr>
-        <w:spacing w:before="0" w:after="40" w:line="264" w:lineRule="auto"/>
-      </w:pPr>
-      <w:r>
-        <w:rPr>
-          <w:rFonts w:ascii="Calibri" w:hAnsi="Calibri" w:eastAsia="Songti SC"/>
-          <w:b/>
-          <w:i w:val="0"/>
-          <w:color w:val="0B2545"/>
-          <w:sz w:val="23"/>
-        </w:rPr>
-        <w:t>3. 日元套利平仓冲击下的多资产组合风险预算重构与凸性防线</w:t>
-      </w:r>
-    </w:p>
-    <w:p>
-      <w:pPr>
-        <w:spacing w:before="0" w:after="40" w:line="264" w:lineRule="auto"/>
-      </w:pPr>
-      <w:r>
-        <w:rPr>
-          <w:rFonts w:ascii="Calibri" w:hAnsi="Calibri" w:eastAsia="Songti SC"/>
-          <w:b w:val="0"/>
-          <w:i w:val="0"/>
-          <w:color w:val="667085"/>
-          <w:sz w:val="17"/>
-        </w:rPr>
-        <w:t>未识别 · 宏观通胀传导 · score 43.2</w:t>
-      </w:r>
-    </w:p>
-    <w:p>
-      <w:pPr>
-        <w:spacing w:before="0" w:after="100" w:line="264" w:lineRule="auto"/>
-      </w:pPr>
-      <w:r>
-        <w:rPr>
-          <w:rFonts w:ascii="Calibri" w:hAnsi="Calibri" w:eastAsia="Songti SC"/>
-          <w:b w:val="0"/>
-          <w:i w:val="0"/>
-          <w:color w:val="334155"/>
-          <w:sz w:val="20"/>
-        </w:rPr>
-        <w:t>研究记录 — 研究 Board 5080a504-eef1-4115-a9f4-6f8091cc16b0 作者角色：大类资产配置师 · 立场：压力测试（STRESS-TEST） 工作日期：2026-07-10（Asia/Singapore） 会话根主题：VIX 17 与 2...</w:t>
-      </w:r>
-    </w:p>
-    <w:p>
-      <w:pPr>
-        <w:spacing w:before="0" w:after="160" w:line="264" w:lineRule="auto"/>
-      </w:pPr>
-      <w:r>
-        <w:rPr>
-          <w:rFonts w:ascii="Calibri" w:hAnsi="Calibri" w:eastAsia="Songti SC"/>
-          <w:b w:val="0"/>
-          <w:i w:val="0"/>
-          <w:color w:val="667085"/>
-          <w:sz w:val="17"/>
-        </w:rPr>
-        <w:t xml:space="preserve">Report: </w:t>
-      </w:r>
-      <w:hyperlink r:id="rId20">
-        <w:r>
-          <w:rPr>
-            <w:color w:val="285B9D"/>
-            <w:u w:val="single"/>
-            <w:rFonts w:eastAsia="Songti SC" w:ascii="Calibri" w:hAnsi="Calibri"/>
-          </w:rPr>
-          <w:t>reports/archive-72f14f51eff6</w:t>
-        </w:r>
-      </w:hyperlink>
-    </w:p>
-    <w:p>
-      <w:pPr>
-        <w:spacing w:before="0" w:after="40" w:line="264" w:lineRule="auto"/>
-      </w:pPr>
-      <w:r>
-        <w:rPr>
-          <w:rFonts w:ascii="Calibri" w:hAnsi="Calibri" w:eastAsia="Songti SC"/>
-          <w:b/>
-          <w:i w:val="0"/>
-          <w:color w:val="0B2545"/>
-          <w:sz w:val="23"/>
-        </w:rPr>
-        <w:t>4. 2026-07-10 策略研究记录：轻度滞胀压力下的防守再平衡</w:t>
-      </w:r>
-    </w:p>
-    <w:p>
-      <w:pPr>
-        <w:spacing w:before="0" w:after="40" w:line="264" w:lineRule="auto"/>
-      </w:pPr>
-      <w:r>
-        <w:rPr>
-          <w:rFonts w:ascii="Calibri" w:hAnsi="Calibri" w:eastAsia="Songti SC"/>
-          <w:b w:val="0"/>
-          <w:i w:val="0"/>
-          <w:color w:val="667085"/>
-          <w:sz w:val="17"/>
-        </w:rPr>
-        <w:t>未识别 · 宏观通胀传导 · score 42.4</w:t>
-      </w:r>
-    </w:p>
-    <w:p>
-      <w:pPr>
-        <w:spacing w:before="0" w:after="100" w:line="264" w:lineRule="auto"/>
-      </w:pPr>
-      <w:r>
-        <w:rPr>
-          <w:rFonts w:ascii="Calibri" w:hAnsi="Calibri" w:eastAsia="Songti SC"/>
-          <w:b w:val="0"/>
-          <w:i w:val="0"/>
-          <w:color w:val="334155"/>
-          <w:sz w:val="20"/>
-        </w:rPr>
-        <w:t>工作日期：2026-07-10，Asia/Singapore。本报告立场是 压力测试并给出执行方案：我支持prior research notes关于10年期美债收益率停留在4.6%附近、商品因地缘风险再起而反弹的“轻度滞胀”设定...</w:t>
-      </w:r>
-    </w:p>
-    <w:p>
-      <w:pPr>
-        <w:spacing w:before="0" w:after="160" w:line="264" w:lineRule="auto"/>
-      </w:pPr>
-      <w:r>
-        <w:rPr>
-          <w:rFonts w:ascii="Calibri" w:hAnsi="Calibri" w:eastAsia="Songti SC"/>
-          <w:b w:val="0"/>
-          <w:i w:val="0"/>
-          <w:color w:val="667085"/>
-          <w:sz w:val="17"/>
-        </w:rPr>
-        <w:t xml:space="preserve">Report: </w:t>
-      </w:r>
-      <w:hyperlink r:id="rId21">
-        <w:r>
-          <w:rPr>
-            <w:color w:val="285B9D"/>
-            <w:u w:val="single"/>
-            <w:rFonts w:eastAsia="Songti SC" w:ascii="Calibri" w:hAnsi="Calibri"/>
-          </w:rPr>
-          <w:t>reports/archive-96ab098c8b4e</w:t>
-        </w:r>
-      </w:hyperlink>
-    </w:p>
-    <w:p>
-      <w:pPr>
-        <w:spacing w:before="0" w:after="40" w:line="264" w:lineRule="auto"/>
-      </w:pPr>
-      <w:r>
-        <w:rPr>
-          <w:rFonts w:ascii="Calibri" w:hAnsi="Calibri" w:eastAsia="Songti SC"/>
-          <w:b/>
-          <w:i w:val="0"/>
-          <w:color w:val="0B2545"/>
-          <w:sz w:val="23"/>
-        </w:rPr>
-        <w:t>5. 研究院诊断报告</w:t>
-      </w:r>
-    </w:p>
-    <w:p>
-      <w:pPr>
-        <w:spacing w:before="0" w:after="40" w:line="264" w:lineRule="auto"/>
-      </w:pPr>
-      <w:r>
-        <w:rPr>
-          <w:rFonts w:ascii="Calibri" w:hAnsi="Calibri" w:eastAsia="Songti SC"/>
-          <w:b w:val="0"/>
-          <w:i w:val="0"/>
-          <w:color w:val="667085"/>
-          <w:sz w:val="17"/>
-        </w:rPr>
-        <w:t>研究院诊断师 · 宏观通胀传导 · score 40.9</w:t>
-      </w:r>
-    </w:p>
-    <w:p>
-      <w:pPr>
-        <w:spacing w:before="0" w:after="100" w:line="264" w:lineRule="auto"/>
-      </w:pPr>
-      <w:r>
-        <w:rPr>
-          <w:rFonts w:ascii="Calibri" w:hAnsi="Calibri" w:eastAsia="Songti SC"/>
-          <w:b w:val="0"/>
-          <w:i w:val="0"/>
-          <w:color w:val="334155"/>
-          <w:sz w:val="20"/>
-        </w:rPr>
-        <w:t>锚定日期：2026-07-10（shell date +%Y-%m-%d ）。未使用 web search；所有证据来自本工作区内的内部文件与端点快照。 fleet health.md 未在工作区出现，且提示中内联的 &lt;&lt;&lt;FLEET HEALTH 区块为...</w:t>
-      </w:r>
-    </w:p>
-    <w:p>
-      <w:pPr>
-        <w:spacing w:before="0" w:after="160" w:line="264" w:lineRule="auto"/>
-      </w:pPr>
-      <w:r>
-        <w:rPr>
-          <w:rFonts w:ascii="Calibri" w:hAnsi="Calibri" w:eastAsia="Songti SC"/>
-          <w:b w:val="0"/>
-          <w:i w:val="0"/>
-          <w:color w:val="667085"/>
-          <w:sz w:val="17"/>
-        </w:rPr>
-        <w:t xml:space="preserve">Report: </w:t>
-      </w:r>
-      <w:hyperlink r:id="rId14">
-        <w:r>
-          <w:rPr>
-            <w:color w:val="285B9D"/>
-            <w:u w:val="single"/>
-            <w:rFonts w:eastAsia="Songti SC" w:ascii="Calibri" w:hAnsi="Calibri"/>
-          </w:rPr>
-          <w:t>reports/archive-9cb3cc592c88</w:t>
-        </w:r>
-      </w:hyperlink>
-    </w:p>
-    <w:p>
-      <w:pPr>
-        <w:spacing w:before="0" w:after="40" w:line="264" w:lineRule="auto"/>
-      </w:pPr>
-      <w:r>
-        <w:rPr>
-          <w:rFonts w:ascii="Calibri" w:hAnsi="Calibri" w:eastAsia="Songti SC"/>
-          <w:b/>
-          <w:i w:val="0"/>
-          <w:color w:val="0B2545"/>
-          <w:sz w:val="23"/>
-        </w:rPr>
-        <w:t>6. 2883.HK 公司概况</w:t>
-      </w:r>
-    </w:p>
-    <w:p>
-      <w:pPr>
-        <w:spacing w:before="0" w:after="40" w:line="264" w:lineRule="auto"/>
-      </w:pPr>
-      <w:r>
-        <w:rPr>
-          <w:rFonts w:ascii="Calibri" w:hAnsi="Calibri" w:eastAsia="Songti SC"/>
-          <w:b w:val="0"/>
-          <w:i w:val="0"/>
-          <w:color w:val="667085"/>
-          <w:sz w:val="17"/>
-        </w:rPr>
-        <w:t>深研主编 · 宏观通胀传导 · score 40.5</w:t>
-      </w:r>
-    </w:p>
-    <w:p>
-      <w:pPr>
-        <w:spacing w:before="0" w:after="100" w:line="264" w:lineRule="auto"/>
-      </w:pPr>
-      <w:r>
-        <w:rPr>
-          <w:rFonts w:ascii="Calibri" w:hAnsi="Calibri" w:eastAsia="Songti SC"/>
-          <w:b w:val="0"/>
-          <w:i w:val="0"/>
-          <w:color w:val="334155"/>
-          <w:sz w:val="20"/>
-        </w:rPr>
-        <w:t>2883.HK 对应中海油田服务股份有限公司（China Oilfield Services Limited，简称“中海油服”或“COSL”），公司 H 股在香港联合交易所上市，股票代码为 2883，A 股在上海证券交易所上市，股票...</w:t>
-      </w:r>
-    </w:p>
-    <w:p>
-      <w:pPr>
-        <w:spacing w:before="0" w:after="160" w:line="264" w:lineRule="auto"/>
-      </w:pPr>
-      <w:r>
-        <w:rPr>
-          <w:rFonts w:ascii="Calibri" w:hAnsi="Calibri" w:eastAsia="Songti SC"/>
-          <w:b w:val="0"/>
-          <w:i w:val="0"/>
-          <w:color w:val="667085"/>
-          <w:sz w:val="17"/>
-        </w:rPr>
-        <w:t xml:space="preserve">Report: </w:t>
-      </w:r>
-      <w:hyperlink r:id="rId22">
-        <w:r>
-          <w:rPr>
-            <w:color w:val="285B9D"/>
-            <w:u w:val="single"/>
-            <w:rFonts w:eastAsia="Songti SC" w:ascii="Calibri" w:hAnsi="Calibri"/>
-          </w:rPr>
-          <w:t>reports/archive-35c211a2cff4</w:t>
         </w:r>
       </w:hyperlink>
     </w:p>
@@ -1115,7 +1115,7 @@
       </w:pPr>
       <w:r>
         <w:rPr>
-          <w:rFonts w:ascii="Calibri" w:hAnsi="Calibri" w:eastAsia="Songti SC"/>
+          <w:rFonts w:ascii="Calibri" w:hAnsi="Calibri" w:eastAsia="Hiragino Sans GB"/>
           <w:b/>
           <w:i w:val="0"/>
           <w:color w:val="0B2545"/>
@@ -1130,7 +1130,7 @@
       </w:pPr>
       <w:r>
         <w:rPr>
-          <w:rFonts w:ascii="Calibri" w:hAnsi="Calibri" w:eastAsia="Songti SC"/>
+          <w:rFonts w:ascii="Calibri" w:hAnsi="Calibri" w:eastAsia="Hiragino Sans GB"/>
           <w:b w:val="0"/>
           <w:i w:val="0"/>
           <w:color w:val="334155"/>
@@ -1145,7 +1145,7 @@
       </w:pPr>
       <w:r>
         <w:rPr>
-          <w:rFonts w:ascii="Calibri" w:hAnsi="Calibri" w:eastAsia="Songti SC"/>
+          <w:rFonts w:ascii="Calibri" w:hAnsi="Calibri" w:eastAsia="Hiragino Sans GB"/>
           <w:b w:val="0"/>
           <w:i w:val="0"/>
           <w:color w:val="667085"/>
@@ -1158,7 +1158,7 @@
           <w:rPr>
             <w:color w:val="285B9D"/>
             <w:u w:val="single"/>
-            <w:rFonts w:eastAsia="Songti SC" w:ascii="Calibri" w:hAnsi="Calibri"/>
+            <w:rFonts w:eastAsia="Hiragino Sans GB" w:ascii="Calibri" w:hAnsi="Calibri"/>
           </w:rPr>
           <w:t>reports/archive-db053b73b427</w:t>
         </w:r>
@@ -1170,7 +1170,7 @@
       </w:pPr>
       <w:r>
         <w:rPr>
-          <w:rFonts w:ascii="Calibri" w:hAnsi="Calibri" w:eastAsia="Songti SC"/>
+          <w:rFonts w:ascii="Calibri" w:hAnsi="Calibri" w:eastAsia="Hiragino Sans GB"/>
           <w:b/>
           <w:i w:val="0"/>
           <w:color w:val="0B2545"/>
@@ -1185,7 +1185,7 @@
       </w:pPr>
       <w:r>
         <w:rPr>
-          <w:rFonts w:ascii="Calibri" w:hAnsi="Calibri" w:eastAsia="Songti SC"/>
+          <w:rFonts w:ascii="Calibri" w:hAnsi="Calibri" w:eastAsia="Hiragino Sans GB"/>
           <w:b w:val="0"/>
           <w:i w:val="0"/>
           <w:color w:val="334155"/>
@@ -1200,7 +1200,7 @@
       </w:pPr>
       <w:r>
         <w:rPr>
-          <w:rFonts w:ascii="Calibri" w:hAnsi="Calibri" w:eastAsia="Songti SC"/>
+          <w:rFonts w:ascii="Calibri" w:hAnsi="Calibri" w:eastAsia="Hiragino Sans GB"/>
           <w:b w:val="0"/>
           <w:i w:val="0"/>
           <w:color w:val="667085"/>
@@ -1208,12 +1208,12 @@
         </w:rPr>
         <w:t xml:space="preserve">Report: </w:t>
       </w:r>
-      <w:hyperlink r:id="rId23">
+      <w:hyperlink r:id="rId24">
         <w:r>
           <w:rPr>
             <w:color w:val="285B9D"/>
             <w:u w:val="single"/>
-            <w:rFonts w:eastAsia="Songti SC" w:ascii="Calibri" w:hAnsi="Calibri"/>
+            <w:rFonts w:eastAsia="Hiragino Sans GB" w:ascii="Calibri" w:hAnsi="Calibri"/>
           </w:rPr>
           <w:t>reports/archive-710afaa90d12</w:t>
         </w:r>
@@ -1225,7 +1225,7 @@
       </w:pPr>
       <w:r>
         <w:rPr>
-          <w:rFonts w:ascii="Calibri" w:hAnsi="Calibri" w:eastAsia="Songti SC"/>
+          <w:rFonts w:ascii="Calibri" w:hAnsi="Calibri" w:eastAsia="Hiragino Sans GB"/>
           <w:b/>
           <w:i w:val="0"/>
           <w:color w:val="0B2545"/>
@@ -1240,7 +1240,7 @@
       </w:pPr>
       <w:r>
         <w:rPr>
-          <w:rFonts w:ascii="Calibri" w:hAnsi="Calibri" w:eastAsia="Songti SC"/>
+          <w:rFonts w:ascii="Calibri" w:hAnsi="Calibri" w:eastAsia="Hiragino Sans GB"/>
           <w:b w:val="0"/>
           <w:i w:val="0"/>
           <w:color w:val="334155"/>
@@ -1255,7 +1255,7 @@
       </w:pPr>
       <w:r>
         <w:rPr>
-          <w:rFonts w:ascii="Calibri" w:hAnsi="Calibri" w:eastAsia="Songti SC"/>
+          <w:rFonts w:ascii="Calibri" w:hAnsi="Calibri" w:eastAsia="Hiragino Sans GB"/>
           <w:b w:val="0"/>
           <w:i w:val="0"/>
           <w:color w:val="667085"/>
@@ -1263,12 +1263,12 @@
         </w:rPr>
         <w:t xml:space="preserve">Report: </w:t>
       </w:r>
-      <w:hyperlink r:id="rId24">
+      <w:hyperlink r:id="rId25">
         <w:r>
           <w:rPr>
             <w:color w:val="285B9D"/>
             <w:u w:val="single"/>
-            <w:rFonts w:eastAsia="Songti SC" w:ascii="Calibri" w:hAnsi="Calibri"/>
+            <w:rFonts w:eastAsia="Hiragino Sans GB" w:ascii="Calibri" w:hAnsi="Calibri"/>
           </w:rPr>
           <w:t>reports/archive-3cad4d3b9917</w:t>
         </w:r>
@@ -1311,7 +1311,7 @@
             <w:r/>
             <w:r>
               <w:rPr>
-                <w:rFonts w:ascii="Calibri" w:hAnsi="Calibri" w:eastAsia="Songti SC"/>
+                <w:rFonts w:ascii="Calibri" w:hAnsi="Calibri" w:eastAsia="Hiragino Sans GB"/>
                 <w:b/>
                 <w:color w:val="475569"/>
                 <w:sz w:val="18"/>
@@ -1334,7 +1334,7 @@
             <w:r/>
             <w:r>
               <w:rPr>
-                <w:rFonts w:ascii="Calibri" w:hAnsi="Calibri" w:eastAsia="Songti SC"/>
+                <w:rFonts w:ascii="Calibri" w:hAnsi="Calibri" w:eastAsia="Hiragino Sans GB"/>
                 <w:b/>
                 <w:color w:val="475569"/>
                 <w:sz w:val="18"/>
@@ -1357,7 +1357,7 @@
             <w:r/>
             <w:r>
               <w:rPr>
-                <w:rFonts w:ascii="Calibri" w:hAnsi="Calibri" w:eastAsia="Songti SC"/>
+                <w:rFonts w:ascii="Calibri" w:hAnsi="Calibri" w:eastAsia="Hiragino Sans GB"/>
                 <w:b/>
                 <w:color w:val="475569"/>
                 <w:sz w:val="18"/>
@@ -1380,7 +1380,7 @@
             <w:r/>
             <w:r>
               <w:rPr>
-                <w:rFonts w:ascii="Calibri" w:hAnsi="Calibri" w:eastAsia="Songti SC"/>
+                <w:rFonts w:ascii="Calibri" w:hAnsi="Calibri" w:eastAsia="Hiragino Sans GB"/>
                 <w:b/>
                 <w:color w:val="475569"/>
                 <w:sz w:val="18"/>
@@ -1403,7 +1403,7 @@
             <w:r/>
             <w:r>
               <w:rPr>
-                <w:rFonts w:ascii="Calibri" w:hAnsi="Calibri" w:eastAsia="Songti SC"/>
+                <w:rFonts w:ascii="Calibri" w:hAnsi="Calibri" w:eastAsia="Hiragino Sans GB"/>
                 <w:b/>
                 <w:color w:val="475569"/>
                 <w:sz w:val="18"/>
@@ -1426,12 +1426,12 @@
             <w:r/>
             <w:r>
               <w:rPr>
-                <w:rFonts w:ascii="Calibri" w:hAnsi="Calibri" w:eastAsia="Songti SC"/>
+                <w:rFonts w:ascii="Calibri" w:hAnsi="Calibri" w:eastAsia="Hiragino Sans GB"/>
                 <w:b w:val="0"/>
                 <w:color w:val="111827"/>
                 <w:sz w:val="17"/>
               </w:rPr>
-              <w:t>全球宏观专题报告：通胀路径验证、美联储反应函数与权益估值压力测试</w:t>
+              <w:t>前序研究研究报告 — 2026-07-10</w:t>
             </w:r>
           </w:p>
         </w:tc>
@@ -1447,7 +1447,7 @@
             <w:r/>
             <w:r>
               <w:rPr>
-                <w:rFonts w:ascii="Calibri" w:hAnsi="Calibri" w:eastAsia="Songti SC"/>
+                <w:rFonts w:ascii="Calibri" w:hAnsi="Calibri" w:eastAsia="Hiragino Sans GB"/>
                 <w:b w:val="0"/>
                 <w:color w:val="111827"/>
                 <w:sz w:val="16"/>
@@ -1468,12 +1468,12 @@
             <w:r/>
             <w:r>
               <w:rPr>
-                <w:rFonts w:ascii="Calibri" w:hAnsi="Calibri" w:eastAsia="Songti SC"/>
+                <w:rFonts w:ascii="Calibri" w:hAnsi="Calibri" w:eastAsia="Hiragino Sans GB"/>
                 <w:b w:val="0"/>
                 <w:color w:val="111827"/>
                 <w:sz w:val="16"/>
               </w:rPr>
-              <w:t>宏观通胀传导</w:t>
+              <w:t>AI 基础设施</w:t>
             </w:r>
           </w:p>
         </w:tc>
@@ -1490,12 +1490,12 @@
             <w:r/>
             <w:r>
               <w:rPr>
-                <w:rFonts w:ascii="Calibri" w:hAnsi="Calibri" w:eastAsia="Songti SC"/>
+                <w:rFonts w:ascii="Calibri" w:hAnsi="Calibri" w:eastAsia="Hiragino Sans GB"/>
                 <w:b/>
                 <w:color w:val="111827"/>
                 <w:sz w:val="17"/>
               </w:rPr>
-              <w:t>44.1</w:t>
+              <w:t>54.4</w:t>
             </w:r>
           </w:p>
         </w:tc>
@@ -1512,7 +1512,225 @@
             <w:r/>
             <w:r>
               <w:rPr>
-                <w:rFonts w:ascii="Calibri" w:hAnsi="Calibri" w:eastAsia="Songti SC"/>
+                <w:rFonts w:ascii="Calibri" w:hAnsi="Calibri" w:eastAsia="Hiragino Sans GB"/>
+                <w:b w:val="0"/>
+                <w:color w:val="111827"/>
+                <w:sz w:val="16"/>
+              </w:rPr>
+              <w:t>风险 1</w:t>
+            </w:r>
+          </w:p>
+        </w:tc>
+      </w:tr>
+      <w:tr>
+        <w:tc>
+          <w:tcPr>
+            <w:tcW w:type="dxa" w:w="3720"/>
+            <w:vAlign w:val="center"/>
+          </w:tcPr>
+          <w:p>
+            <w:pPr>
+              <w:spacing w:before="0" w:after="0"/>
+            </w:pPr>
+            <w:r/>
+            <w:r>
+              <w:rPr>
+                <w:rFonts w:ascii="Calibri" w:hAnsi="Calibri" w:eastAsia="Hiragino Sans GB"/>
+                <w:b w:val="0"/>
+                <w:color w:val="111827"/>
+                <w:sz w:val="17"/>
+              </w:rPr>
+              <w:t>能源与利率成本双重挤压：AI 算力基础设施的 Capex 韧性</w:t>
+            </w:r>
+          </w:p>
+        </w:tc>
+        <w:tc>
+          <w:tcPr>
+            <w:tcW w:type="dxa" w:w="1560"/>
+            <w:vAlign w:val="center"/>
+          </w:tcPr>
+          <w:p>
+            <w:pPr>
+              <w:spacing w:before="0" w:after="0"/>
+            </w:pPr>
+            <w:r/>
+            <w:r>
+              <w:rPr>
+                <w:rFonts w:ascii="Calibri" w:hAnsi="Calibri" w:eastAsia="Hiragino Sans GB"/>
+                <w:b w:val="0"/>
+                <w:color w:val="111827"/>
+                <w:sz w:val="16"/>
+              </w:rPr>
+              <w:t>未识别</w:t>
+            </w:r>
+          </w:p>
+        </w:tc>
+        <w:tc>
+          <w:tcPr>
+            <w:tcW w:type="dxa" w:w="1680"/>
+            <w:vAlign w:val="center"/>
+          </w:tcPr>
+          <w:p>
+            <w:pPr>
+              <w:spacing w:before="0" w:after="0"/>
+            </w:pPr>
+            <w:r/>
+            <w:r>
+              <w:rPr>
+                <w:rFonts w:ascii="Calibri" w:hAnsi="Calibri" w:eastAsia="Hiragino Sans GB"/>
+                <w:b w:val="0"/>
+                <w:color w:val="111827"/>
+                <w:sz w:val="16"/>
+              </w:rPr>
+              <w:t>AI 基础设施</w:t>
+            </w:r>
+          </w:p>
+        </w:tc>
+        <w:tc>
+          <w:tcPr>
+            <w:tcW w:type="dxa" w:w="900"/>
+            <w:vAlign w:val="center"/>
+          </w:tcPr>
+          <w:p>
+            <w:pPr>
+              <w:spacing w:before="0" w:after="0"/>
+              <w:jc w:val="center"/>
+            </w:pPr>
+            <w:r/>
+            <w:r>
+              <w:rPr>
+                <w:rFonts w:ascii="Calibri" w:hAnsi="Calibri" w:eastAsia="Hiragino Sans GB"/>
+                <w:b/>
+                <w:color w:val="111827"/>
+                <w:sz w:val="17"/>
+              </w:rPr>
+              <w:t>47.0</w:t>
+            </w:r>
+          </w:p>
+        </w:tc>
+        <w:tc>
+          <w:tcPr>
+            <w:tcW w:type="dxa" w:w="1500"/>
+            <w:vAlign w:val="center"/>
+          </w:tcPr>
+          <w:p>
+            <w:pPr>
+              <w:spacing w:before="0" w:after="0"/>
+              <w:jc w:val="center"/>
+            </w:pPr>
+            <w:r/>
+            <w:r>
+              <w:rPr>
+                <w:rFonts w:ascii="Calibri" w:hAnsi="Calibri" w:eastAsia="Hiragino Sans GB"/>
+                <w:b w:val="0"/>
+                <w:color w:val="111827"/>
+                <w:sz w:val="16"/>
+              </w:rPr>
+              <w:t>风险 1</w:t>
+            </w:r>
+          </w:p>
+        </w:tc>
+      </w:tr>
+      <w:tr>
+        <w:tc>
+          <w:tcPr>
+            <w:tcW w:type="dxa" w:w="3720"/>
+            <w:vAlign w:val="center"/>
+          </w:tcPr>
+          <w:p>
+            <w:pPr>
+              <w:spacing w:before="0" w:after="0"/>
+            </w:pPr>
+            <w:r/>
+            <w:r>
+              <w:rPr>
+                <w:rFonts w:ascii="Calibri" w:hAnsi="Calibri" w:eastAsia="Hiragino Sans GB"/>
+                <w:b w:val="0"/>
+                <w:color w:val="111827"/>
+                <w:sz w:val="17"/>
+              </w:rPr>
+              <w:t>公用事业压力测试：电网接入、变压器、调峰电源与绿电交易能否支撑2026–2027年智算扩张？</w:t>
+            </w:r>
+          </w:p>
+        </w:tc>
+        <w:tc>
+          <w:tcPr>
+            <w:tcW w:type="dxa" w:w="1560"/>
+            <w:vAlign w:val="center"/>
+          </w:tcPr>
+          <w:p>
+            <w:pPr>
+              <w:spacing w:before="0" w:after="0"/>
+            </w:pPr>
+            <w:r/>
+            <w:r>
+              <w:rPr>
+                <w:rFonts w:ascii="Calibri" w:hAnsi="Calibri" w:eastAsia="Hiragino Sans GB"/>
+                <w:b w:val="0"/>
+                <w:color w:val="111827"/>
+                <w:sz w:val="16"/>
+              </w:rPr>
+              <w:t>未识别</w:t>
+            </w:r>
+          </w:p>
+        </w:tc>
+        <w:tc>
+          <w:tcPr>
+            <w:tcW w:type="dxa" w:w="1680"/>
+            <w:vAlign w:val="center"/>
+          </w:tcPr>
+          <w:p>
+            <w:pPr>
+              <w:spacing w:before="0" w:after="0"/>
+            </w:pPr>
+            <w:r/>
+            <w:r>
+              <w:rPr>
+                <w:rFonts w:ascii="Calibri" w:hAnsi="Calibri" w:eastAsia="Hiragino Sans GB"/>
+                <w:b w:val="0"/>
+                <w:color w:val="111827"/>
+                <w:sz w:val="16"/>
+              </w:rPr>
+              <w:t>电力与电网</w:t>
+            </w:r>
+          </w:p>
+        </w:tc>
+        <w:tc>
+          <w:tcPr>
+            <w:tcW w:type="dxa" w:w="900"/>
+            <w:vAlign w:val="center"/>
+          </w:tcPr>
+          <w:p>
+            <w:pPr>
+              <w:spacing w:before="0" w:after="0"/>
+              <w:jc w:val="center"/>
+            </w:pPr>
+            <w:r/>
+            <w:r>
+              <w:rPr>
+                <w:rFonts w:ascii="Calibri" w:hAnsi="Calibri" w:eastAsia="Hiragino Sans GB"/>
+                <w:b/>
+                <w:color w:val="111827"/>
+                <w:sz w:val="17"/>
+              </w:rPr>
+              <w:t>47.0</w:t>
+            </w:r>
+          </w:p>
+        </w:tc>
+        <w:tc>
+          <w:tcPr>
+            <w:tcW w:type="dxa" w:w="1500"/>
+            <w:vAlign w:val="center"/>
+          </w:tcPr>
+          <w:p>
+            <w:pPr>
+              <w:spacing w:before="0" w:after="0"/>
+              <w:jc w:val="center"/>
+            </w:pPr>
+            <w:r/>
+            <w:r>
+              <w:rPr>
+                <w:rFonts w:ascii="Calibri" w:hAnsi="Calibri" w:eastAsia="Hiragino Sans GB"/>
                 <w:b w:val="0"/>
                 <w:color w:val="111827"/>
                 <w:sz w:val="16"/>
@@ -1535,12 +1753,12 @@
             <w:r/>
             <w:r>
               <w:rPr>
-                <w:rFonts w:ascii="Calibri" w:hAnsi="Calibri" w:eastAsia="Songti SC"/>
+                <w:rFonts w:ascii="Calibri" w:hAnsi="Calibri" w:eastAsia="Hiragino Sans GB"/>
                 <w:b w:val="0"/>
                 <w:color w:val="111827"/>
                 <w:sz w:val="17"/>
               </w:rPr>
-              <w:t>把央行流动性时钟转化为红利腿与组合风险预算的最终权重报告</w:t>
+              <w:t>压力测试：电力设备与温控出海链的机构筹码拥挤度 vs. 估值安全边际</w:t>
             </w:r>
           </w:p>
         </w:tc>
@@ -1556,7 +1774,7 @@
             <w:r/>
             <w:r>
               <w:rPr>
-                <w:rFonts w:ascii="Calibri" w:hAnsi="Calibri" w:eastAsia="Songti SC"/>
+                <w:rFonts w:ascii="Calibri" w:hAnsi="Calibri" w:eastAsia="Hiragino Sans GB"/>
                 <w:b w:val="0"/>
                 <w:color w:val="111827"/>
                 <w:sz w:val="16"/>
@@ -1577,7 +1795,7 @@
             <w:r/>
             <w:r>
               <w:rPr>
-                <w:rFonts w:ascii="Calibri" w:hAnsi="Calibri" w:eastAsia="Songti SC"/>
+                <w:rFonts w:ascii="Calibri" w:hAnsi="Calibri" w:eastAsia="Hiragino Sans GB"/>
                 <w:b w:val="0"/>
                 <w:color w:val="111827"/>
                 <w:sz w:val="16"/>
@@ -1599,12 +1817,12 @@
             <w:r/>
             <w:r>
               <w:rPr>
-                <w:rFonts w:ascii="Calibri" w:hAnsi="Calibri" w:eastAsia="Songti SC"/>
+                <w:rFonts w:ascii="Calibri" w:hAnsi="Calibri" w:eastAsia="Hiragino Sans GB"/>
                 <w:b/>
                 <w:color w:val="111827"/>
                 <w:sz w:val="17"/>
               </w:rPr>
-              <w:t>43.8</w:t>
+              <w:t>45.2</w:t>
             </w:r>
           </w:p>
         </w:tc>
@@ -1621,7 +1839,7 @@
             <w:r/>
             <w:r>
               <w:rPr>
-                <w:rFonts w:ascii="Calibri" w:hAnsi="Calibri" w:eastAsia="Songti SC"/>
+                <w:rFonts w:ascii="Calibri" w:hAnsi="Calibri" w:eastAsia="Hiragino Sans GB"/>
                 <w:b w:val="0"/>
                 <w:color w:val="111827"/>
                 <w:sz w:val="16"/>
@@ -1644,12 +1862,12 @@
             <w:r/>
             <w:r>
               <w:rPr>
-                <w:rFonts w:ascii="Calibri" w:hAnsi="Calibri" w:eastAsia="Songti SC"/>
+                <w:rFonts w:ascii="Calibri" w:hAnsi="Calibri" w:eastAsia="Hiragino Sans GB"/>
                 <w:b w:val="0"/>
                 <w:color w:val="111827"/>
                 <w:sz w:val="17"/>
               </w:rPr>
-              <w:t>日元套利平仓冲击下的多资产组合风险预算重构与凸性防线</w:t>
+              <w:t>全球宏观专题报告：通胀路径验证、美联储反应函数与权益估值压力测试</w:t>
             </w:r>
           </w:p>
         </w:tc>
@@ -1665,7 +1883,7 @@
             <w:r/>
             <w:r>
               <w:rPr>
-                <w:rFonts w:ascii="Calibri" w:hAnsi="Calibri" w:eastAsia="Songti SC"/>
+                <w:rFonts w:ascii="Calibri" w:hAnsi="Calibri" w:eastAsia="Hiragino Sans GB"/>
                 <w:b w:val="0"/>
                 <w:color w:val="111827"/>
                 <w:sz w:val="16"/>
@@ -1686,7 +1904,7 @@
             <w:r/>
             <w:r>
               <w:rPr>
-                <w:rFonts w:ascii="Calibri" w:hAnsi="Calibri" w:eastAsia="Songti SC"/>
+                <w:rFonts w:ascii="Calibri" w:hAnsi="Calibri" w:eastAsia="Hiragino Sans GB"/>
                 <w:b w:val="0"/>
                 <w:color w:val="111827"/>
                 <w:sz w:val="16"/>
@@ -1708,12 +1926,12 @@
             <w:r/>
             <w:r>
               <w:rPr>
-                <w:rFonts w:ascii="Calibri" w:hAnsi="Calibri" w:eastAsia="Songti SC"/>
+                <w:rFonts w:ascii="Calibri" w:hAnsi="Calibri" w:eastAsia="Hiragino Sans GB"/>
                 <w:b/>
                 <w:color w:val="111827"/>
                 <w:sz w:val="17"/>
               </w:rPr>
-              <w:t>43.2</w:t>
+              <w:t>44.1</w:t>
             </w:r>
           </w:p>
         </w:tc>
@@ -1730,7 +1948,7 @@
             <w:r/>
             <w:r>
               <w:rPr>
-                <w:rFonts w:ascii="Calibri" w:hAnsi="Calibri" w:eastAsia="Songti SC"/>
+                <w:rFonts w:ascii="Calibri" w:hAnsi="Calibri" w:eastAsia="Hiragino Sans GB"/>
                 <w:b w:val="0"/>
                 <w:color w:val="111827"/>
                 <w:sz w:val="16"/>
@@ -1753,12 +1971,12 @@
             <w:r/>
             <w:r>
               <w:rPr>
-                <w:rFonts w:ascii="Calibri" w:hAnsi="Calibri" w:eastAsia="Songti SC"/>
+                <w:rFonts w:ascii="Calibri" w:hAnsi="Calibri" w:eastAsia="Hiragino Sans GB"/>
                 <w:b w:val="0"/>
                 <w:color w:val="111827"/>
                 <w:sz w:val="17"/>
               </w:rPr>
-              <w:t>2026-07-10 策略研究记录：轻度滞胀压力下的防守再平衡</w:t>
+              <w:t>把央行流动性时钟转化为红利腿与组合风险预算的最终权重报告</w:t>
             </w:r>
           </w:p>
         </w:tc>
@@ -1774,7 +1992,7 @@
             <w:r/>
             <w:r>
               <w:rPr>
-                <w:rFonts w:ascii="Calibri" w:hAnsi="Calibri" w:eastAsia="Songti SC"/>
+                <w:rFonts w:ascii="Calibri" w:hAnsi="Calibri" w:eastAsia="Hiragino Sans GB"/>
                 <w:b w:val="0"/>
                 <w:color w:val="111827"/>
                 <w:sz w:val="16"/>
@@ -1795,7 +2013,7 @@
             <w:r/>
             <w:r>
               <w:rPr>
-                <w:rFonts w:ascii="Calibri" w:hAnsi="Calibri" w:eastAsia="Songti SC"/>
+                <w:rFonts w:ascii="Calibri" w:hAnsi="Calibri" w:eastAsia="Hiragino Sans GB"/>
                 <w:b w:val="0"/>
                 <w:color w:val="111827"/>
                 <w:sz w:val="16"/>
@@ -1817,12 +2035,12 @@
             <w:r/>
             <w:r>
               <w:rPr>
-                <w:rFonts w:ascii="Calibri" w:hAnsi="Calibri" w:eastAsia="Songti SC"/>
+                <w:rFonts w:ascii="Calibri" w:hAnsi="Calibri" w:eastAsia="Hiragino Sans GB"/>
                 <w:b/>
                 <w:color w:val="111827"/>
                 <w:sz w:val="17"/>
               </w:rPr>
-              <w:t>42.4</w:t>
+              <w:t>43.8</w:t>
             </w:r>
           </w:p>
         </w:tc>
@@ -1839,7 +2057,225 @@
             <w:r/>
             <w:r>
               <w:rPr>
-                <w:rFonts w:ascii="Calibri" w:hAnsi="Calibri" w:eastAsia="Songti SC"/>
+                <w:rFonts w:ascii="Calibri" w:hAnsi="Calibri" w:eastAsia="Hiragino Sans GB"/>
+                <w:b w:val="0"/>
+                <w:color w:val="111827"/>
+                <w:sz w:val="16"/>
+              </w:rPr>
+              <w:t>风险 1</w:t>
+            </w:r>
+          </w:p>
+        </w:tc>
+      </w:tr>
+      <w:tr>
+        <w:tc>
+          <w:tcPr>
+            <w:tcW w:type="dxa" w:w="3720"/>
+            <w:vAlign w:val="center"/>
+          </w:tcPr>
+          <w:p>
+            <w:pPr>
+              <w:spacing w:before="0" w:after="0"/>
+            </w:pPr>
+            <w:r/>
+            <w:r>
+              <w:rPr>
+                <w:rFonts w:ascii="Calibri" w:hAnsi="Calibri" w:eastAsia="Hiragino Sans GB"/>
+                <w:b w:val="0"/>
+                <w:color w:val="111827"/>
+                <w:sz w:val="17"/>
+              </w:rPr>
+              <w:t>容量电价与辅助服务市场化下电力运营商微观盈利模型重构</w:t>
+            </w:r>
+          </w:p>
+        </w:tc>
+        <w:tc>
+          <w:tcPr>
+            <w:tcW w:type="dxa" w:w="1560"/>
+            <w:vAlign w:val="center"/>
+          </w:tcPr>
+          <w:p>
+            <w:pPr>
+              <w:spacing w:before="0" w:after="0"/>
+            </w:pPr>
+            <w:r/>
+            <w:r>
+              <w:rPr>
+                <w:rFonts w:ascii="Calibri" w:hAnsi="Calibri" w:eastAsia="Hiragino Sans GB"/>
+                <w:b w:val="0"/>
+                <w:color w:val="111827"/>
+                <w:sz w:val="16"/>
+              </w:rPr>
+              <w:t>未识别</w:t>
+            </w:r>
+          </w:p>
+        </w:tc>
+        <w:tc>
+          <w:tcPr>
+            <w:tcW w:type="dxa" w:w="1680"/>
+            <w:vAlign w:val="center"/>
+          </w:tcPr>
+          <w:p>
+            <w:pPr>
+              <w:spacing w:before="0" w:after="0"/>
+            </w:pPr>
+            <w:r/>
+            <w:r>
+              <w:rPr>
+                <w:rFonts w:ascii="Calibri" w:hAnsi="Calibri" w:eastAsia="Hiragino Sans GB"/>
+                <w:b w:val="0"/>
+                <w:color w:val="111827"/>
+                <w:sz w:val="16"/>
+              </w:rPr>
+              <w:t>电力与电网</w:t>
+            </w:r>
+          </w:p>
+        </w:tc>
+        <w:tc>
+          <w:tcPr>
+            <w:tcW w:type="dxa" w:w="900"/>
+            <w:vAlign w:val="center"/>
+          </w:tcPr>
+          <w:p>
+            <w:pPr>
+              <w:spacing w:before="0" w:after="0"/>
+              <w:jc w:val="center"/>
+            </w:pPr>
+            <w:r/>
+            <w:r>
+              <w:rPr>
+                <w:rFonts w:ascii="Calibri" w:hAnsi="Calibri" w:eastAsia="Hiragino Sans GB"/>
+                <w:b/>
+                <w:color w:val="111827"/>
+                <w:sz w:val="17"/>
+              </w:rPr>
+              <w:t>43.7</w:t>
+            </w:r>
+          </w:p>
+        </w:tc>
+        <w:tc>
+          <w:tcPr>
+            <w:tcW w:type="dxa" w:w="1500"/>
+            <w:vAlign w:val="center"/>
+          </w:tcPr>
+          <w:p>
+            <w:pPr>
+              <w:spacing w:before="0" w:after="0"/>
+              <w:jc w:val="center"/>
+            </w:pPr>
+            <w:r/>
+            <w:r>
+              <w:rPr>
+                <w:rFonts w:ascii="Calibri" w:hAnsi="Calibri" w:eastAsia="Hiragino Sans GB"/>
+                <w:b w:val="0"/>
+                <w:color w:val="111827"/>
+                <w:sz w:val="16"/>
+              </w:rPr>
+              <w:t>常规</w:t>
+            </w:r>
+          </w:p>
+        </w:tc>
+      </w:tr>
+      <w:tr>
+        <w:tc>
+          <w:tcPr>
+            <w:tcW w:type="dxa" w:w="3720"/>
+            <w:vAlign w:val="center"/>
+          </w:tcPr>
+          <w:p>
+            <w:pPr>
+              <w:spacing w:before="0" w:after="0"/>
+            </w:pPr>
+            <w:r/>
+            <w:r>
+              <w:rPr>
+                <w:rFonts w:ascii="Calibri" w:hAnsi="Calibri" w:eastAsia="Hiragino Sans GB"/>
+                <w:b w:val="0"/>
+                <w:color w:val="111827"/>
+                <w:sz w:val="17"/>
+              </w:rPr>
+              <w:t>日元套利平仓冲击下的多资产组合风险预算重构与凸性防线</w:t>
+            </w:r>
+          </w:p>
+        </w:tc>
+        <w:tc>
+          <w:tcPr>
+            <w:tcW w:type="dxa" w:w="1560"/>
+            <w:vAlign w:val="center"/>
+          </w:tcPr>
+          <w:p>
+            <w:pPr>
+              <w:spacing w:before="0" w:after="0"/>
+            </w:pPr>
+            <w:r/>
+            <w:r>
+              <w:rPr>
+                <w:rFonts w:ascii="Calibri" w:hAnsi="Calibri" w:eastAsia="Hiragino Sans GB"/>
+                <w:b w:val="0"/>
+                <w:color w:val="111827"/>
+                <w:sz w:val="16"/>
+              </w:rPr>
+              <w:t>未识别</w:t>
+            </w:r>
+          </w:p>
+        </w:tc>
+        <w:tc>
+          <w:tcPr>
+            <w:tcW w:type="dxa" w:w="1680"/>
+            <w:vAlign w:val="center"/>
+          </w:tcPr>
+          <w:p>
+            <w:pPr>
+              <w:spacing w:before="0" w:after="0"/>
+            </w:pPr>
+            <w:r/>
+            <w:r>
+              <w:rPr>
+                <w:rFonts w:ascii="Calibri" w:hAnsi="Calibri" w:eastAsia="Hiragino Sans GB"/>
+                <w:b w:val="0"/>
+                <w:color w:val="111827"/>
+                <w:sz w:val="16"/>
+              </w:rPr>
+              <w:t>宏观通胀传导</w:t>
+            </w:r>
+          </w:p>
+        </w:tc>
+        <w:tc>
+          <w:tcPr>
+            <w:tcW w:type="dxa" w:w="900"/>
+            <w:vAlign w:val="center"/>
+          </w:tcPr>
+          <w:p>
+            <w:pPr>
+              <w:spacing w:before="0" w:after="0"/>
+              <w:jc w:val="center"/>
+            </w:pPr>
+            <w:r/>
+            <w:r>
+              <w:rPr>
+                <w:rFonts w:ascii="Calibri" w:hAnsi="Calibri" w:eastAsia="Hiragino Sans GB"/>
+                <w:b/>
+                <w:color w:val="111827"/>
+                <w:sz w:val="17"/>
+              </w:rPr>
+              <w:t>43.2</w:t>
+            </w:r>
+          </w:p>
+        </w:tc>
+        <w:tc>
+          <w:tcPr>
+            <w:tcW w:type="dxa" w:w="1500"/>
+            <w:vAlign w:val="center"/>
+          </w:tcPr>
+          <w:p>
+            <w:pPr>
+              <w:spacing w:before="0" w:after="0"/>
+              <w:jc w:val="center"/>
+            </w:pPr>
+            <w:r/>
+            <w:r>
+              <w:rPr>
+                <w:rFonts w:ascii="Calibri" w:hAnsi="Calibri" w:eastAsia="Hiragino Sans GB"/>
                 <w:b w:val="0"/>
                 <w:color w:val="111827"/>
                 <w:sz w:val="16"/>
@@ -1862,12 +2298,12 @@
             <w:r/>
             <w:r>
               <w:rPr>
-                <w:rFonts w:ascii="Calibri" w:hAnsi="Calibri" w:eastAsia="Songti SC"/>
+                <w:rFonts w:ascii="Calibri" w:hAnsi="Calibri" w:eastAsia="Hiragino Sans GB"/>
                 <w:b w:val="0"/>
                 <w:color w:val="111827"/>
                 <w:sz w:val="17"/>
               </w:rPr>
-              <w:t>研究院诊断报告</w:t>
+              <w:t>A股硬科技：从拥挤的AI芯片重配至订单可验证的电力设备、储能与液冷改造链</w:t>
             </w:r>
           </w:p>
         </w:tc>
@@ -1883,12 +2319,12 @@
             <w:r/>
             <w:r>
               <w:rPr>
-                <w:rFonts w:ascii="Calibri" w:hAnsi="Calibri" w:eastAsia="Songti SC"/>
+                <w:rFonts w:ascii="Calibri" w:hAnsi="Calibri" w:eastAsia="Hiragino Sans GB"/>
                 <w:b w:val="0"/>
                 <w:color w:val="111827"/>
                 <w:sz w:val="16"/>
               </w:rPr>
-              <w:t>研究院诊断师</w:t>
+              <w:t>未识别</w:t>
             </w:r>
           </w:p>
         </w:tc>
@@ -1904,7 +2340,7 @@
             <w:r/>
             <w:r>
               <w:rPr>
-                <w:rFonts w:ascii="Calibri" w:hAnsi="Calibri" w:eastAsia="Songti SC"/>
+                <w:rFonts w:ascii="Calibri" w:hAnsi="Calibri" w:eastAsia="Hiragino Sans GB"/>
                 <w:b w:val="0"/>
                 <w:color w:val="111827"/>
                 <w:sz w:val="16"/>
@@ -1926,7 +2362,661 @@
             <w:r/>
             <w:r>
               <w:rPr>
-                <w:rFonts w:ascii="Calibri" w:hAnsi="Calibri" w:eastAsia="Songti SC"/>
+                <w:rFonts w:ascii="Calibri" w:hAnsi="Calibri" w:eastAsia="Hiragino Sans GB"/>
+                <w:b/>
+                <w:color w:val="111827"/>
+                <w:sz w:val="17"/>
+              </w:rPr>
+              <w:t>42.7</w:t>
+            </w:r>
+          </w:p>
+        </w:tc>
+        <w:tc>
+          <w:tcPr>
+            <w:tcW w:type="dxa" w:w="1500"/>
+            <w:vAlign w:val="center"/>
+          </w:tcPr>
+          <w:p>
+            <w:pPr>
+              <w:spacing w:before="0" w:after="0"/>
+              <w:jc w:val="center"/>
+            </w:pPr>
+            <w:r/>
+            <w:r>
+              <w:rPr>
+                <w:rFonts w:ascii="Calibri" w:hAnsi="Calibri" w:eastAsia="Hiragino Sans GB"/>
+                <w:b w:val="0"/>
+                <w:color w:val="111827"/>
+                <w:sz w:val="16"/>
+              </w:rPr>
+              <w:t>常规</w:t>
+            </w:r>
+          </w:p>
+        </w:tc>
+      </w:tr>
+      <w:tr>
+        <w:tc>
+          <w:tcPr>
+            <w:tcW w:type="dxa" w:w="3720"/>
+            <w:vAlign w:val="center"/>
+          </w:tcPr>
+          <w:p>
+            <w:pPr>
+              <w:spacing w:before="0" w:after="0"/>
+            </w:pPr>
+            <w:r/>
+            <w:r>
+              <w:rPr>
+                <w:rFonts w:ascii="Calibri" w:hAnsi="Calibri" w:eastAsia="Hiragino Sans GB"/>
+                <w:b w:val="0"/>
+                <w:color w:val="111827"/>
+                <w:sz w:val="17"/>
+              </w:rPr>
+              <w:t>2026-07-10 半导体国产化向AI算力基础设施与电力需求的传导评估</w:t>
+            </w:r>
+          </w:p>
+        </w:tc>
+        <w:tc>
+          <w:tcPr>
+            <w:tcW w:type="dxa" w:w="1560"/>
+            <w:vAlign w:val="center"/>
+          </w:tcPr>
+          <w:p>
+            <w:pPr>
+              <w:spacing w:before="0" w:after="0"/>
+            </w:pPr>
+            <w:r/>
+            <w:r>
+              <w:rPr>
+                <w:rFonts w:ascii="Calibri" w:hAnsi="Calibri" w:eastAsia="Hiragino Sans GB"/>
+                <w:b w:val="0"/>
+                <w:color w:val="111827"/>
+                <w:sz w:val="16"/>
+              </w:rPr>
+              <w:t>未识别</w:t>
+            </w:r>
+          </w:p>
+        </w:tc>
+        <w:tc>
+          <w:tcPr>
+            <w:tcW w:type="dxa" w:w="1680"/>
+            <w:vAlign w:val="center"/>
+          </w:tcPr>
+          <w:p>
+            <w:pPr>
+              <w:spacing w:before="0" w:after="0"/>
+            </w:pPr>
+            <w:r/>
+            <w:r>
+              <w:rPr>
+                <w:rFonts w:ascii="Calibri" w:hAnsi="Calibri" w:eastAsia="Hiragino Sans GB"/>
+                <w:b w:val="0"/>
+                <w:color w:val="111827"/>
+                <w:sz w:val="16"/>
+              </w:rPr>
+              <w:t>AI 基础设施</w:t>
+            </w:r>
+          </w:p>
+        </w:tc>
+        <w:tc>
+          <w:tcPr>
+            <w:tcW w:type="dxa" w:w="900"/>
+            <w:vAlign w:val="center"/>
+          </w:tcPr>
+          <w:p>
+            <w:pPr>
+              <w:spacing w:before="0" w:after="0"/>
+              <w:jc w:val="center"/>
+            </w:pPr>
+            <w:r/>
+            <w:r>
+              <w:rPr>
+                <w:rFonts w:ascii="Calibri" w:hAnsi="Calibri" w:eastAsia="Hiragino Sans GB"/>
+                <w:b/>
+                <w:color w:val="111827"/>
+                <w:sz w:val="17"/>
+              </w:rPr>
+              <w:t>42.7</w:t>
+            </w:r>
+          </w:p>
+        </w:tc>
+        <w:tc>
+          <w:tcPr>
+            <w:tcW w:type="dxa" w:w="1500"/>
+            <w:vAlign w:val="center"/>
+          </w:tcPr>
+          <w:p>
+            <w:pPr>
+              <w:spacing w:before="0" w:after="0"/>
+              <w:jc w:val="center"/>
+            </w:pPr>
+            <w:r/>
+            <w:r>
+              <w:rPr>
+                <w:rFonts w:ascii="Calibri" w:hAnsi="Calibri" w:eastAsia="Hiragino Sans GB"/>
+                <w:b w:val="0"/>
+                <w:color w:val="111827"/>
+                <w:sz w:val="16"/>
+              </w:rPr>
+              <w:t>常规</w:t>
+            </w:r>
+          </w:p>
+        </w:tc>
+      </w:tr>
+      <w:tr>
+        <w:tc>
+          <w:tcPr>
+            <w:tcW w:type="dxa" w:w="3720"/>
+            <w:vAlign w:val="center"/>
+          </w:tcPr>
+          <w:p>
+            <w:pPr>
+              <w:spacing w:before="0" w:after="0"/>
+            </w:pPr>
+            <w:r/>
+            <w:r>
+              <w:rPr>
+                <w:rFonts w:ascii="Calibri" w:hAnsi="Calibri" w:eastAsia="Hiragino Sans GB"/>
+                <w:b w:val="0"/>
+                <w:color w:val="111827"/>
+                <w:sz w:val="17"/>
+              </w:rPr>
+              <w:t>前序研究研究报告 — 2026-07-10</w:t>
+            </w:r>
+          </w:p>
+        </w:tc>
+        <w:tc>
+          <w:tcPr>
+            <w:tcW w:type="dxa" w:w="1560"/>
+            <w:vAlign w:val="center"/>
+          </w:tcPr>
+          <w:p>
+            <w:pPr>
+              <w:spacing w:before="0" w:after="0"/>
+            </w:pPr>
+            <w:r/>
+            <w:r>
+              <w:rPr>
+                <w:rFonts w:ascii="Calibri" w:hAnsi="Calibri" w:eastAsia="Hiragino Sans GB"/>
+                <w:b w:val="0"/>
+                <w:color w:val="111827"/>
+                <w:sz w:val="16"/>
+              </w:rPr>
+              <w:t>未识别</w:t>
+            </w:r>
+          </w:p>
+        </w:tc>
+        <w:tc>
+          <w:tcPr>
+            <w:tcW w:type="dxa" w:w="1680"/>
+            <w:vAlign w:val="center"/>
+          </w:tcPr>
+          <w:p>
+            <w:pPr>
+              <w:spacing w:before="0" w:after="0"/>
+            </w:pPr>
+            <w:r/>
+            <w:r>
+              <w:rPr>
+                <w:rFonts w:ascii="Calibri" w:hAnsi="Calibri" w:eastAsia="Hiragino Sans GB"/>
+                <w:b w:val="0"/>
+                <w:color w:val="111827"/>
+                <w:sz w:val="16"/>
+              </w:rPr>
+              <w:t>电力与电网</w:t>
+            </w:r>
+          </w:p>
+        </w:tc>
+        <w:tc>
+          <w:tcPr>
+            <w:tcW w:type="dxa" w:w="900"/>
+            <w:vAlign w:val="center"/>
+          </w:tcPr>
+          <w:p>
+            <w:pPr>
+              <w:spacing w:before="0" w:after="0"/>
+              <w:jc w:val="center"/>
+            </w:pPr>
+            <w:r/>
+            <w:r>
+              <w:rPr>
+                <w:rFonts w:ascii="Calibri" w:hAnsi="Calibri" w:eastAsia="Hiragino Sans GB"/>
+                <w:b/>
+                <w:color w:val="111827"/>
+                <w:sz w:val="17"/>
+              </w:rPr>
+              <w:t>42.6</w:t>
+            </w:r>
+          </w:p>
+        </w:tc>
+        <w:tc>
+          <w:tcPr>
+            <w:tcW w:type="dxa" w:w="1500"/>
+            <w:vAlign w:val="center"/>
+          </w:tcPr>
+          <w:p>
+            <w:pPr>
+              <w:spacing w:before="0" w:after="0"/>
+              <w:jc w:val="center"/>
+            </w:pPr>
+            <w:r/>
+            <w:r>
+              <w:rPr>
+                <w:rFonts w:ascii="Calibri" w:hAnsi="Calibri" w:eastAsia="Hiragino Sans GB"/>
+                <w:b w:val="0"/>
+                <w:color w:val="111827"/>
+                <w:sz w:val="16"/>
+              </w:rPr>
+              <w:t>常规</w:t>
+            </w:r>
+          </w:p>
+        </w:tc>
+      </w:tr>
+      <w:tr>
+        <w:tc>
+          <w:tcPr>
+            <w:tcW w:type="dxa" w:w="3720"/>
+            <w:vAlign w:val="center"/>
+          </w:tcPr>
+          <w:p>
+            <w:pPr>
+              <w:spacing w:before="0" w:after="0"/>
+            </w:pPr>
+            <w:r/>
+            <w:r>
+              <w:rPr>
+                <w:rFonts w:ascii="Calibri" w:hAnsi="Calibri" w:eastAsia="Hiragino Sans GB"/>
+                <w:b w:val="0"/>
+                <w:color w:val="111827"/>
+                <w:sz w:val="17"/>
+              </w:rPr>
+              <w:t>2026-07-10 策略研究记录：轻度滞胀压力下的防守再平衡</w:t>
+            </w:r>
+          </w:p>
+        </w:tc>
+        <w:tc>
+          <w:tcPr>
+            <w:tcW w:type="dxa" w:w="1560"/>
+            <w:vAlign w:val="center"/>
+          </w:tcPr>
+          <w:p>
+            <w:pPr>
+              <w:spacing w:before="0" w:after="0"/>
+            </w:pPr>
+            <w:r/>
+            <w:r>
+              <w:rPr>
+                <w:rFonts w:ascii="Calibri" w:hAnsi="Calibri" w:eastAsia="Hiragino Sans GB"/>
+                <w:b w:val="0"/>
+                <w:color w:val="111827"/>
+                <w:sz w:val="16"/>
+              </w:rPr>
+              <w:t>未识别</w:t>
+            </w:r>
+          </w:p>
+        </w:tc>
+        <w:tc>
+          <w:tcPr>
+            <w:tcW w:type="dxa" w:w="1680"/>
+            <w:vAlign w:val="center"/>
+          </w:tcPr>
+          <w:p>
+            <w:pPr>
+              <w:spacing w:before="0" w:after="0"/>
+            </w:pPr>
+            <w:r/>
+            <w:r>
+              <w:rPr>
+                <w:rFonts w:ascii="Calibri" w:hAnsi="Calibri" w:eastAsia="Hiragino Sans GB"/>
+                <w:b w:val="0"/>
+                <w:color w:val="111827"/>
+                <w:sz w:val="16"/>
+              </w:rPr>
+              <w:t>宏观通胀传导</w:t>
+            </w:r>
+          </w:p>
+        </w:tc>
+        <w:tc>
+          <w:tcPr>
+            <w:tcW w:type="dxa" w:w="900"/>
+            <w:vAlign w:val="center"/>
+          </w:tcPr>
+          <w:p>
+            <w:pPr>
+              <w:spacing w:before="0" w:after="0"/>
+              <w:jc w:val="center"/>
+            </w:pPr>
+            <w:r/>
+            <w:r>
+              <w:rPr>
+                <w:rFonts w:ascii="Calibri" w:hAnsi="Calibri" w:eastAsia="Hiragino Sans GB"/>
+                <w:b/>
+                <w:color w:val="111827"/>
+                <w:sz w:val="17"/>
+              </w:rPr>
+              <w:t>42.4</w:t>
+            </w:r>
+          </w:p>
+        </w:tc>
+        <w:tc>
+          <w:tcPr>
+            <w:tcW w:type="dxa" w:w="1500"/>
+            <w:vAlign w:val="center"/>
+          </w:tcPr>
+          <w:p>
+            <w:pPr>
+              <w:spacing w:before="0" w:after="0"/>
+              <w:jc w:val="center"/>
+            </w:pPr>
+            <w:r/>
+            <w:r>
+              <w:rPr>
+                <w:rFonts w:ascii="Calibri" w:hAnsi="Calibri" w:eastAsia="Hiragino Sans GB"/>
+                <w:b w:val="0"/>
+                <w:color w:val="111827"/>
+                <w:sz w:val="16"/>
+              </w:rPr>
+              <w:t>风险 2</w:t>
+            </w:r>
+          </w:p>
+        </w:tc>
+      </w:tr>
+      <w:tr>
+        <w:tc>
+          <w:tcPr>
+            <w:tcW w:type="dxa" w:w="3720"/>
+            <w:vAlign w:val="center"/>
+          </w:tcPr>
+          <w:p>
+            <w:pPr>
+              <w:spacing w:before="0" w:after="0"/>
+            </w:pPr>
+            <w:r/>
+            <w:r>
+              <w:rPr>
+                <w:rFonts w:ascii="Calibri" w:hAnsi="Calibri" w:eastAsia="Hiragino Sans GB"/>
+                <w:b w:val="0"/>
+                <w:color w:val="111827"/>
+                <w:sz w:val="17"/>
+              </w:rPr>
+              <w:t>公用事业行业研究报告：2026年下半年电力公用事业底仓的分红质量、电价传导与拥挤度风险压力测试</w:t>
+            </w:r>
+          </w:p>
+        </w:tc>
+        <w:tc>
+          <w:tcPr>
+            <w:tcW w:type="dxa" w:w="1560"/>
+            <w:vAlign w:val="center"/>
+          </w:tcPr>
+          <w:p>
+            <w:pPr>
+              <w:spacing w:before="0" w:after="0"/>
+            </w:pPr>
+            <w:r/>
+            <w:r>
+              <w:rPr>
+                <w:rFonts w:ascii="Calibri" w:hAnsi="Calibri" w:eastAsia="Hiragino Sans GB"/>
+                <w:b w:val="0"/>
+                <w:color w:val="111827"/>
+                <w:sz w:val="16"/>
+              </w:rPr>
+              <w:t>未识别</w:t>
+            </w:r>
+          </w:p>
+        </w:tc>
+        <w:tc>
+          <w:tcPr>
+            <w:tcW w:type="dxa" w:w="1680"/>
+            <w:vAlign w:val="center"/>
+          </w:tcPr>
+          <w:p>
+            <w:pPr>
+              <w:spacing w:before="0" w:after="0"/>
+            </w:pPr>
+            <w:r/>
+            <w:r>
+              <w:rPr>
+                <w:rFonts w:ascii="Calibri" w:hAnsi="Calibri" w:eastAsia="Hiragino Sans GB"/>
+                <w:b w:val="0"/>
+                <w:color w:val="111827"/>
+                <w:sz w:val="16"/>
+              </w:rPr>
+              <w:t>电力与电网</w:t>
+            </w:r>
+          </w:p>
+        </w:tc>
+        <w:tc>
+          <w:tcPr>
+            <w:tcW w:type="dxa" w:w="900"/>
+            <w:vAlign w:val="center"/>
+          </w:tcPr>
+          <w:p>
+            <w:pPr>
+              <w:spacing w:before="0" w:after="0"/>
+              <w:jc w:val="center"/>
+            </w:pPr>
+            <w:r/>
+            <w:r>
+              <w:rPr>
+                <w:rFonts w:ascii="Calibri" w:hAnsi="Calibri" w:eastAsia="Hiragino Sans GB"/>
+                <w:b/>
+                <w:color w:val="111827"/>
+                <w:sz w:val="17"/>
+              </w:rPr>
+              <w:t>42.3</w:t>
+            </w:r>
+          </w:p>
+        </w:tc>
+        <w:tc>
+          <w:tcPr>
+            <w:tcW w:type="dxa" w:w="1500"/>
+            <w:vAlign w:val="center"/>
+          </w:tcPr>
+          <w:p>
+            <w:pPr>
+              <w:spacing w:before="0" w:after="0"/>
+              <w:jc w:val="center"/>
+            </w:pPr>
+            <w:r/>
+            <w:r>
+              <w:rPr>
+                <w:rFonts w:ascii="Calibri" w:hAnsi="Calibri" w:eastAsia="Hiragino Sans GB"/>
+                <w:b w:val="0"/>
+                <w:color w:val="111827"/>
+                <w:sz w:val="16"/>
+              </w:rPr>
+              <w:t>风险 2</w:t>
+            </w:r>
+          </w:p>
+        </w:tc>
+      </w:tr>
+      <w:tr>
+        <w:tc>
+          <w:tcPr>
+            <w:tcW w:type="dxa" w:w="3720"/>
+            <w:vAlign w:val="center"/>
+          </w:tcPr>
+          <w:p>
+            <w:pPr>
+              <w:spacing w:before="0" w:after="0"/>
+            </w:pPr>
+            <w:r/>
+            <w:r>
+              <w:rPr>
+                <w:rFonts w:ascii="Calibri" w:hAnsi="Calibri" w:eastAsia="Hiragino Sans GB"/>
+                <w:b w:val="0"/>
+                <w:color w:val="111827"/>
+                <w:sz w:val="17"/>
+              </w:rPr>
+              <w:t>03 行业定位</w:t>
+            </w:r>
+          </w:p>
+        </w:tc>
+        <w:tc>
+          <w:tcPr>
+            <w:tcW w:type="dxa" w:w="1560"/>
+            <w:vAlign w:val="center"/>
+          </w:tcPr>
+          <w:p>
+            <w:pPr>
+              <w:spacing w:before="0" w:after="0"/>
+            </w:pPr>
+            <w:r/>
+            <w:r>
+              <w:rPr>
+                <w:rFonts w:ascii="Calibri" w:hAnsi="Calibri" w:eastAsia="Hiragino Sans GB"/>
+                <w:b w:val="0"/>
+                <w:color w:val="111827"/>
+                <w:sz w:val="16"/>
+              </w:rPr>
+              <w:t>深研主编</w:t>
+            </w:r>
+          </w:p>
+        </w:tc>
+        <w:tc>
+          <w:tcPr>
+            <w:tcW w:type="dxa" w:w="1680"/>
+            <w:vAlign w:val="center"/>
+          </w:tcPr>
+          <w:p>
+            <w:pPr>
+              <w:spacing w:before="0" w:after="0"/>
+            </w:pPr>
+            <w:r/>
+            <w:r>
+              <w:rPr>
+                <w:rFonts w:ascii="Calibri" w:hAnsi="Calibri" w:eastAsia="Hiragino Sans GB"/>
+                <w:b w:val="0"/>
+                <w:color w:val="111827"/>
+                <w:sz w:val="16"/>
+              </w:rPr>
+              <w:t>宏观通胀传导</w:t>
+            </w:r>
+          </w:p>
+        </w:tc>
+        <w:tc>
+          <w:tcPr>
+            <w:tcW w:type="dxa" w:w="900"/>
+            <w:vAlign w:val="center"/>
+          </w:tcPr>
+          <w:p>
+            <w:pPr>
+              <w:spacing w:before="0" w:after="0"/>
+              <w:jc w:val="center"/>
+            </w:pPr>
+            <w:r/>
+            <w:r>
+              <w:rPr>
+                <w:rFonts w:ascii="Calibri" w:hAnsi="Calibri" w:eastAsia="Hiragino Sans GB"/>
+                <w:b/>
+                <w:color w:val="111827"/>
+                <w:sz w:val="17"/>
+              </w:rPr>
+              <w:t>42.1</w:t>
+            </w:r>
+          </w:p>
+        </w:tc>
+        <w:tc>
+          <w:tcPr>
+            <w:tcW w:type="dxa" w:w="1500"/>
+            <w:vAlign w:val="center"/>
+          </w:tcPr>
+          <w:p>
+            <w:pPr>
+              <w:spacing w:before="0" w:after="0"/>
+              <w:jc w:val="center"/>
+            </w:pPr>
+            <w:r/>
+            <w:r>
+              <w:rPr>
+                <w:rFonts w:ascii="Calibri" w:hAnsi="Calibri" w:eastAsia="Hiragino Sans GB"/>
+                <w:b w:val="0"/>
+                <w:color w:val="111827"/>
+                <w:sz w:val="16"/>
+              </w:rPr>
+              <w:t>风险 2</w:t>
+            </w:r>
+          </w:p>
+        </w:tc>
+      </w:tr>
+      <w:tr>
+        <w:tc>
+          <w:tcPr>
+            <w:tcW w:type="dxa" w:w="3720"/>
+            <w:vAlign w:val="center"/>
+          </w:tcPr>
+          <w:p>
+            <w:pPr>
+              <w:spacing w:before="0" w:after="0"/>
+            </w:pPr>
+            <w:r/>
+            <w:r>
+              <w:rPr>
+                <w:rFonts w:ascii="Calibri" w:hAnsi="Calibri" w:eastAsia="Hiragino Sans GB"/>
+                <w:b w:val="0"/>
+                <w:color w:val="111827"/>
+                <w:sz w:val="17"/>
+              </w:rPr>
+              <w:t>研究院诊断报告</w:t>
+            </w:r>
+          </w:p>
+        </w:tc>
+        <w:tc>
+          <w:tcPr>
+            <w:tcW w:type="dxa" w:w="1560"/>
+            <w:vAlign w:val="center"/>
+          </w:tcPr>
+          <w:p>
+            <w:pPr>
+              <w:spacing w:before="0" w:after="0"/>
+            </w:pPr>
+            <w:r/>
+            <w:r>
+              <w:rPr>
+                <w:rFonts w:ascii="Calibri" w:hAnsi="Calibri" w:eastAsia="Hiragino Sans GB"/>
+                <w:b w:val="0"/>
+                <w:color w:val="111827"/>
+                <w:sz w:val="16"/>
+              </w:rPr>
+              <w:t>研究院诊断师</w:t>
+            </w:r>
+          </w:p>
+        </w:tc>
+        <w:tc>
+          <w:tcPr>
+            <w:tcW w:type="dxa" w:w="1680"/>
+            <w:vAlign w:val="center"/>
+          </w:tcPr>
+          <w:p>
+            <w:pPr>
+              <w:spacing w:before="0" w:after="0"/>
+            </w:pPr>
+            <w:r/>
+            <w:r>
+              <w:rPr>
+                <w:rFonts w:ascii="Calibri" w:hAnsi="Calibri" w:eastAsia="Hiragino Sans GB"/>
+                <w:b w:val="0"/>
+                <w:color w:val="111827"/>
+                <w:sz w:val="16"/>
+              </w:rPr>
+              <w:t>宏观通胀传导</w:t>
+            </w:r>
+          </w:p>
+        </w:tc>
+        <w:tc>
+          <w:tcPr>
+            <w:tcW w:type="dxa" w:w="900"/>
+            <w:vAlign w:val="center"/>
+          </w:tcPr>
+          <w:p>
+            <w:pPr>
+              <w:spacing w:before="0" w:after="0"/>
+              <w:jc w:val="center"/>
+            </w:pPr>
+            <w:r/>
+            <w:r>
+              <w:rPr>
+                <w:rFonts w:ascii="Calibri" w:hAnsi="Calibri" w:eastAsia="Hiragino Sans GB"/>
                 <w:b/>
                 <w:color w:val="111827"/>
                 <w:sz w:val="17"/>
@@ -1948,7 +3038,7 @@
             <w:r/>
             <w:r>
               <w:rPr>
-                <w:rFonts w:ascii="Calibri" w:hAnsi="Calibri" w:eastAsia="Songti SC"/>
+                <w:rFonts w:ascii="Calibri" w:hAnsi="Calibri" w:eastAsia="Hiragino Sans GB"/>
                 <w:b w:val="0"/>
                 <w:color w:val="111827"/>
                 <w:sz w:val="16"/>
@@ -1971,12 +3061,12 @@
             <w:r/>
             <w:r>
               <w:rPr>
-                <w:rFonts w:ascii="Calibri" w:hAnsi="Calibri" w:eastAsia="Songti SC"/>
+                <w:rFonts w:ascii="Calibri" w:hAnsi="Calibri" w:eastAsia="Hiragino Sans GB"/>
                 <w:b w:val="0"/>
                 <w:color w:val="111827"/>
                 <w:sz w:val="17"/>
               </w:rPr>
-              <w:t>2883.HK 公司概况</w:t>
+              <w:t>前序研究研究报告 — 2026-07-10</w:t>
             </w:r>
           </w:p>
         </w:tc>
@@ -1992,12 +3082,12 @@
             <w:r/>
             <w:r>
               <w:rPr>
-                <w:rFonts w:ascii="Calibri" w:hAnsi="Calibri" w:eastAsia="Songti SC"/>
+                <w:rFonts w:ascii="Calibri" w:hAnsi="Calibri" w:eastAsia="Hiragino Sans GB"/>
                 <w:b w:val="0"/>
                 <w:color w:val="111827"/>
                 <w:sz w:val="16"/>
               </w:rPr>
-              <w:t>深研主编</w:t>
+              <w:t>未识别</w:t>
             </w:r>
           </w:p>
         </w:tc>
@@ -2013,7 +3103,7 @@
             <w:r/>
             <w:r>
               <w:rPr>
-                <w:rFonts w:ascii="Calibri" w:hAnsi="Calibri" w:eastAsia="Songti SC"/>
+                <w:rFonts w:ascii="Calibri" w:hAnsi="Calibri" w:eastAsia="Hiragino Sans GB"/>
                 <w:b w:val="0"/>
                 <w:color w:val="111827"/>
                 <w:sz w:val="16"/>
@@ -2035,12 +3125,12 @@
             <w:r/>
             <w:r>
               <w:rPr>
-                <w:rFonts w:ascii="Calibri" w:hAnsi="Calibri" w:eastAsia="Songti SC"/>
+                <w:rFonts w:ascii="Calibri" w:hAnsi="Calibri" w:eastAsia="Hiragino Sans GB"/>
                 <w:b/>
                 <w:color w:val="111827"/>
                 <w:sz w:val="17"/>
               </w:rPr>
-              <w:t>40.5</w:t>
+              <w:t>40.9</w:t>
             </w:r>
           </w:p>
         </w:tc>
@@ -2057,116 +3147,7 @@
             <w:r/>
             <w:r>
               <w:rPr>
-                <w:rFonts w:ascii="Calibri" w:hAnsi="Calibri" w:eastAsia="Songti SC"/>
-                <w:b w:val="0"/>
-                <w:color w:val="111827"/>
-                <w:sz w:val="16"/>
-              </w:rPr>
-              <w:t>风险 1</w:t>
-            </w:r>
-          </w:p>
-        </w:tc>
-      </w:tr>
-      <w:tr>
-        <w:tc>
-          <w:tcPr>
-            <w:tcW w:type="dxa" w:w="3720"/>
-            <w:vAlign w:val="center"/>
-          </w:tcPr>
-          <w:p>
-            <w:pPr>
-              <w:spacing w:before="0" w:after="0"/>
-            </w:pPr>
-            <w:r/>
-            <w:r>
-              <w:rPr>
-                <w:rFonts w:ascii="Calibri" w:hAnsi="Calibri" w:eastAsia="Songti SC"/>
-                <w:b w:val="0"/>
-                <w:color w:val="111827"/>
-                <w:sz w:val="17"/>
-              </w:rPr>
-              <w:t>2026-07-10 全球宏观报告：中国生产资料PPI再通胀能否传导至核心CPI？</w:t>
-            </w:r>
-          </w:p>
-        </w:tc>
-        <w:tc>
-          <w:tcPr>
-            <w:tcW w:type="dxa" w:w="1560"/>
-            <w:vAlign w:val="center"/>
-          </w:tcPr>
-          <w:p>
-            <w:pPr>
-              <w:spacing w:before="0" w:after="0"/>
-            </w:pPr>
-            <w:r/>
-            <w:r>
-              <w:rPr>
-                <w:rFonts w:ascii="Calibri" w:hAnsi="Calibri" w:eastAsia="Songti SC"/>
-                <w:b w:val="0"/>
-                <w:color w:val="111827"/>
-                <w:sz w:val="16"/>
-              </w:rPr>
-              <w:t>未识别</w:t>
-            </w:r>
-          </w:p>
-        </w:tc>
-        <w:tc>
-          <w:tcPr>
-            <w:tcW w:type="dxa" w:w="1680"/>
-            <w:vAlign w:val="center"/>
-          </w:tcPr>
-          <w:p>
-            <w:pPr>
-              <w:spacing w:before="0" w:after="0"/>
-            </w:pPr>
-            <w:r/>
-            <w:r>
-              <w:rPr>
-                <w:rFonts w:ascii="Calibri" w:hAnsi="Calibri" w:eastAsia="Songti SC"/>
-                <w:b w:val="0"/>
-                <w:color w:val="111827"/>
-                <w:sz w:val="16"/>
-              </w:rPr>
-              <w:t>宏观通胀传导</w:t>
-            </w:r>
-          </w:p>
-        </w:tc>
-        <w:tc>
-          <w:tcPr>
-            <w:tcW w:type="dxa" w:w="900"/>
-            <w:vAlign w:val="center"/>
-          </w:tcPr>
-          <w:p>
-            <w:pPr>
-              <w:spacing w:before="0" w:after="0"/>
-              <w:jc w:val="center"/>
-            </w:pPr>
-            <w:r/>
-            <w:r>
-              <w:rPr>
-                <w:rFonts w:ascii="Calibri" w:hAnsi="Calibri" w:eastAsia="Songti SC"/>
-                <w:b/>
-                <w:color w:val="111827"/>
-                <w:sz w:val="17"/>
-              </w:rPr>
-              <w:t>40.5</w:t>
-            </w:r>
-          </w:p>
-        </w:tc>
-        <w:tc>
-          <w:tcPr>
-            <w:tcW w:type="dxa" w:w="1500"/>
-            <w:vAlign w:val="center"/>
-          </w:tcPr>
-          <w:p>
-            <w:pPr>
-              <w:spacing w:before="0" w:after="0"/>
-              <w:jc w:val="center"/>
-            </w:pPr>
-            <w:r/>
-            <w:r>
-              <w:rPr>
-                <w:rFonts w:ascii="Calibri" w:hAnsi="Calibri" w:eastAsia="Songti SC"/>
+                <w:rFonts w:ascii="Calibri" w:hAnsi="Calibri" w:eastAsia="Hiragino Sans GB"/>
                 <w:b w:val="0"/>
                 <w:color w:val="111827"/>
                 <w:sz w:val="16"/>
@@ -2189,12 +3170,12 @@
             <w:r/>
             <w:r>
               <w:rPr>
-                <w:rFonts w:ascii="Calibri" w:hAnsi="Calibri" w:eastAsia="Songti SC"/>
+                <w:rFonts w:ascii="Calibri" w:hAnsi="Calibri" w:eastAsia="Hiragino Sans GB"/>
                 <w:b w:val="0"/>
                 <w:color w:val="111827"/>
                 <w:sz w:val="17"/>
               </w:rPr>
-              <w:t>USD/CNH 6.87 阈值后的动态套保与离岸美元流动性监控</w:t>
+              <w:t>04 催化剂</w:t>
             </w:r>
           </w:p>
         </w:tc>
@@ -2210,12 +3191,12 @@
             <w:r/>
             <w:r>
               <w:rPr>
-                <w:rFonts w:ascii="Calibri" w:hAnsi="Calibri" w:eastAsia="Songti SC"/>
+                <w:rFonts w:ascii="Calibri" w:hAnsi="Calibri" w:eastAsia="Hiragino Sans GB"/>
                 <w:b w:val="0"/>
                 <w:color w:val="111827"/>
                 <w:sz w:val="16"/>
               </w:rPr>
-              <w:t>未识别</w:t>
+              <w:t>深研主编</w:t>
             </w:r>
           </w:p>
         </w:tc>
@@ -2231,116 +3212,7 @@
             <w:r/>
             <w:r>
               <w:rPr>
-                <w:rFonts w:ascii="Calibri" w:hAnsi="Calibri" w:eastAsia="Songti SC"/>
-                <w:b w:val="0"/>
-                <w:color w:val="111827"/>
-                <w:sz w:val="16"/>
-              </w:rPr>
-              <w:t>AI 基础设施</w:t>
-            </w:r>
-          </w:p>
-        </w:tc>
-        <w:tc>
-          <w:tcPr>
-            <w:tcW w:type="dxa" w:w="900"/>
-            <w:vAlign w:val="center"/>
-          </w:tcPr>
-          <w:p>
-            <w:pPr>
-              <w:spacing w:before="0" w:after="0"/>
-              <w:jc w:val="center"/>
-            </w:pPr>
-            <w:r/>
-            <w:r>
-              <w:rPr>
-                <w:rFonts w:ascii="Calibri" w:hAnsi="Calibri" w:eastAsia="Songti SC"/>
-                <w:b/>
-                <w:color w:val="111827"/>
-                <w:sz w:val="17"/>
-              </w:rPr>
-              <w:t>40.2</w:t>
-            </w:r>
-          </w:p>
-        </w:tc>
-        <w:tc>
-          <w:tcPr>
-            <w:tcW w:type="dxa" w:w="1500"/>
-            <w:vAlign w:val="center"/>
-          </w:tcPr>
-          <w:p>
-            <w:pPr>
-              <w:spacing w:before="0" w:after="0"/>
-              <w:jc w:val="center"/>
-            </w:pPr>
-            <w:r/>
-            <w:r>
-              <w:rPr>
-                <w:rFonts w:ascii="Calibri" w:hAnsi="Calibri" w:eastAsia="Songti SC"/>
-                <w:b w:val="0"/>
-                <w:color w:val="111827"/>
-                <w:sz w:val="16"/>
-              </w:rPr>
-              <w:t>风险 2</w:t>
-            </w:r>
-          </w:p>
-        </w:tc>
-      </w:tr>
-      <w:tr>
-        <w:tc>
-          <w:tcPr>
-            <w:tcW w:type="dxa" w:w="3720"/>
-            <w:vAlign w:val="center"/>
-          </w:tcPr>
-          <w:p>
-            <w:pPr>
-              <w:spacing w:before="0" w:after="0"/>
-            </w:pPr>
-            <w:r/>
-            <w:r>
-              <w:rPr>
-                <w:rFonts w:ascii="Calibri" w:hAnsi="Calibri" w:eastAsia="Songti SC"/>
-                <w:b w:val="0"/>
-                <w:color w:val="111827"/>
-                <w:sz w:val="17"/>
-              </w:rPr>
-              <w:t>10Y CGB跌破1.70%的利率曲线与久期反转压力测试 — 2026-07-10</w:t>
-            </w:r>
-          </w:p>
-        </w:tc>
-        <w:tc>
-          <w:tcPr>
-            <w:tcW w:type="dxa" w:w="1560"/>
-            <w:vAlign w:val="center"/>
-          </w:tcPr>
-          <w:p>
-            <w:pPr>
-              <w:spacing w:before="0" w:after="0"/>
-            </w:pPr>
-            <w:r/>
-            <w:r>
-              <w:rPr>
-                <w:rFonts w:ascii="Calibri" w:hAnsi="Calibri" w:eastAsia="Songti SC"/>
-                <w:b w:val="0"/>
-                <w:color w:val="111827"/>
-                <w:sz w:val="16"/>
-              </w:rPr>
-              <w:t>未识别</w:t>
-            </w:r>
-          </w:p>
-        </w:tc>
-        <w:tc>
-          <w:tcPr>
-            <w:tcW w:type="dxa" w:w="1680"/>
-            <w:vAlign w:val="center"/>
-          </w:tcPr>
-          <w:p>
-            <w:pPr>
-              <w:spacing w:before="0" w:after="0"/>
-            </w:pPr>
-            <w:r/>
-            <w:r>
-              <w:rPr>
-                <w:rFonts w:ascii="Calibri" w:hAnsi="Calibri" w:eastAsia="Songti SC"/>
+                <w:rFonts w:ascii="Calibri" w:hAnsi="Calibri" w:eastAsia="Hiragino Sans GB"/>
                 <w:b w:val="0"/>
                 <w:color w:val="111827"/>
                 <w:sz w:val="16"/>
@@ -2362,12 +3234,12 @@
             <w:r/>
             <w:r>
               <w:rPr>
-                <w:rFonts w:ascii="Calibri" w:hAnsi="Calibri" w:eastAsia="Songti SC"/>
+                <w:rFonts w:ascii="Calibri" w:hAnsi="Calibri" w:eastAsia="Hiragino Sans GB"/>
                 <w:b/>
                 <w:color w:val="111827"/>
                 <w:sz w:val="17"/>
               </w:rPr>
-              <w:t>40.1</w:t>
+              <w:t>40.9</w:t>
             </w:r>
           </w:p>
         </w:tc>
@@ -2384,225 +3256,7 @@
             <w:r/>
             <w:r>
               <w:rPr>
-                <w:rFonts w:ascii="Calibri" w:hAnsi="Calibri" w:eastAsia="Songti SC"/>
-                <w:b w:val="0"/>
-                <w:color w:val="111827"/>
-                <w:sz w:val="16"/>
-              </w:rPr>
-              <w:t>风险 1</w:t>
-            </w:r>
-          </w:p>
-        </w:tc>
-      </w:tr>
-      <w:tr>
-        <w:tc>
-          <w:tcPr>
-            <w:tcW w:type="dxa" w:w="3720"/>
-            <w:vAlign w:val="center"/>
-          </w:tcPr>
-          <w:p>
-            <w:pPr>
-              <w:spacing w:before="0" w:after="0"/>
-            </w:pPr>
-            <w:r/>
-            <w:r>
-              <w:rPr>
-                <w:rFonts w:ascii="Calibri" w:hAnsi="Calibri" w:eastAsia="Songti SC"/>
-                <w:b w:val="0"/>
-                <w:color w:val="111827"/>
-                <w:sz w:val="17"/>
-              </w:rPr>
-              <w:t>2026-07-10 宏观研究记录：油价冲击为何没有引发典型避险？</w:t>
-            </w:r>
-          </w:p>
-        </w:tc>
-        <w:tc>
-          <w:tcPr>
-            <w:tcW w:type="dxa" w:w="1560"/>
-            <w:vAlign w:val="center"/>
-          </w:tcPr>
-          <w:p>
-            <w:pPr>
-              <w:spacing w:before="0" w:after="0"/>
-            </w:pPr>
-            <w:r/>
-            <w:r>
-              <w:rPr>
-                <w:rFonts w:ascii="Calibri" w:hAnsi="Calibri" w:eastAsia="Songti SC"/>
-                <w:b w:val="0"/>
-                <w:color w:val="111827"/>
-                <w:sz w:val="16"/>
-              </w:rPr>
-              <w:t>未识别</w:t>
-            </w:r>
-          </w:p>
-        </w:tc>
-        <w:tc>
-          <w:tcPr>
-            <w:tcW w:type="dxa" w:w="1680"/>
-            <w:vAlign w:val="center"/>
-          </w:tcPr>
-          <w:p>
-            <w:pPr>
-              <w:spacing w:before="0" w:after="0"/>
-            </w:pPr>
-            <w:r/>
-            <w:r>
-              <w:rPr>
-                <w:rFonts w:ascii="Calibri" w:hAnsi="Calibri" w:eastAsia="Songti SC"/>
-                <w:b w:val="0"/>
-                <w:color w:val="111827"/>
-                <w:sz w:val="16"/>
-              </w:rPr>
-              <w:t>AI 基础设施</w:t>
-            </w:r>
-          </w:p>
-        </w:tc>
-        <w:tc>
-          <w:tcPr>
-            <w:tcW w:type="dxa" w:w="900"/>
-            <w:vAlign w:val="center"/>
-          </w:tcPr>
-          <w:p>
-            <w:pPr>
-              <w:spacing w:before="0" w:after="0"/>
-              <w:jc w:val="center"/>
-            </w:pPr>
-            <w:r/>
-            <w:r>
-              <w:rPr>
-                <w:rFonts w:ascii="Calibri" w:hAnsi="Calibri" w:eastAsia="Songti SC"/>
-                <w:b/>
-                <w:color w:val="111827"/>
-                <w:sz w:val="17"/>
-              </w:rPr>
-              <w:t>39.6</w:t>
-            </w:r>
-          </w:p>
-        </w:tc>
-        <w:tc>
-          <w:tcPr>
-            <w:tcW w:type="dxa" w:w="1500"/>
-            <w:vAlign w:val="center"/>
-          </w:tcPr>
-          <w:p>
-            <w:pPr>
-              <w:spacing w:before="0" w:after="0"/>
-              <w:jc w:val="center"/>
-            </w:pPr>
-            <w:r/>
-            <w:r>
-              <w:rPr>
-                <w:rFonts w:ascii="Calibri" w:hAnsi="Calibri" w:eastAsia="Songti SC"/>
-                <w:b w:val="0"/>
-                <w:color w:val="111827"/>
-                <w:sz w:val="16"/>
-              </w:rPr>
-              <w:t>风险 2</w:t>
-            </w:r>
-          </w:p>
-        </w:tc>
-      </w:tr>
-      <w:tr>
-        <w:tc>
-          <w:tcPr>
-            <w:tcW w:type="dxa" w:w="3720"/>
-            <w:vAlign w:val="center"/>
-          </w:tcPr>
-          <w:p>
-            <w:pPr>
-              <w:spacing w:before="0" w:after="0"/>
-            </w:pPr>
-            <w:r/>
-            <w:r>
-              <w:rPr>
-                <w:rFonts w:ascii="Calibri" w:hAnsi="Calibri" w:eastAsia="Songti SC"/>
-                <w:b w:val="0"/>
-                <w:color w:val="111827"/>
-                <w:sz w:val="17"/>
-              </w:rPr>
-              <w:t>Recent operator-action digest</w:t>
-            </w:r>
-          </w:p>
-        </w:tc>
-        <w:tc>
-          <w:tcPr>
-            <w:tcW w:type="dxa" w:w="1560"/>
-            <w:vAlign w:val="center"/>
-          </w:tcPr>
-          <w:p>
-            <w:pPr>
-              <w:spacing w:before="0" w:after="0"/>
-            </w:pPr>
-            <w:r/>
-            <w:r>
-              <w:rPr>
-                <w:rFonts w:ascii="Calibri" w:hAnsi="Calibri" w:eastAsia="Songti SC"/>
-                <w:b w:val="0"/>
-                <w:color w:val="111827"/>
-                <w:sz w:val="16"/>
-              </w:rPr>
-              <w:t>研究院诊断师</w:t>
-            </w:r>
-          </w:p>
-        </w:tc>
-        <w:tc>
-          <w:tcPr>
-            <w:tcW w:type="dxa" w:w="1680"/>
-            <w:vAlign w:val="center"/>
-          </w:tcPr>
-          <w:p>
-            <w:pPr>
-              <w:spacing w:before="0" w:after="0"/>
-            </w:pPr>
-            <w:r/>
-            <w:r>
-              <w:rPr>
-                <w:rFonts w:ascii="Calibri" w:hAnsi="Calibri" w:eastAsia="Songti SC"/>
-                <w:b w:val="0"/>
-                <w:color w:val="111827"/>
-                <w:sz w:val="16"/>
-              </w:rPr>
-              <w:t>宏观通胀传导</w:t>
-            </w:r>
-          </w:p>
-        </w:tc>
-        <w:tc>
-          <w:tcPr>
-            <w:tcW w:type="dxa" w:w="900"/>
-            <w:vAlign w:val="center"/>
-          </w:tcPr>
-          <w:p>
-            <w:pPr>
-              <w:spacing w:before="0" w:after="0"/>
-              <w:jc w:val="center"/>
-            </w:pPr>
-            <w:r/>
-            <w:r>
-              <w:rPr>
-                <w:rFonts w:ascii="Calibri" w:hAnsi="Calibri" w:eastAsia="Songti SC"/>
-                <w:b/>
-                <w:color w:val="111827"/>
-                <w:sz w:val="17"/>
-              </w:rPr>
-              <w:t>39.1</w:t>
-            </w:r>
-          </w:p>
-        </w:tc>
-        <w:tc>
-          <w:tcPr>
-            <w:tcW w:type="dxa" w:w="1500"/>
-            <w:vAlign w:val="center"/>
-          </w:tcPr>
-          <w:p>
-            <w:pPr>
-              <w:spacing w:before="0" w:after="0"/>
-              <w:jc w:val="center"/>
-            </w:pPr>
-            <w:r/>
-            <w:r>
-              <w:rPr>
-                <w:rFonts w:ascii="Calibri" w:hAnsi="Calibri" w:eastAsia="Songti SC"/>
+                <w:rFonts w:ascii="Calibri" w:hAnsi="Calibri" w:eastAsia="Hiragino Sans GB"/>
                 <w:b w:val="0"/>
                 <w:color w:val="111827"/>
                 <w:sz w:val="16"/>
@@ -2625,12 +3279,12 @@
             <w:r/>
             <w:r>
               <w:rPr>
-                <w:rFonts w:ascii="Calibri" w:hAnsi="Calibri" w:eastAsia="Songti SC"/>
+                <w:rFonts w:ascii="Calibri" w:hAnsi="Calibri" w:eastAsia="Hiragino Sans GB"/>
                 <w:b w:val="0"/>
                 <w:color w:val="111827"/>
                 <w:sz w:val="17"/>
               </w:rPr>
-              <w:t>2026-07-10 研究报告：分化再通胀下的跨资产配置——久期、CNY、A股风格与商品的系统配置</w:t>
+              <w:t>10 目标价</w:t>
             </w:r>
           </w:p>
         </w:tc>
@@ -2646,12 +3300,12 @@
             <w:r/>
             <w:r>
               <w:rPr>
-                <w:rFonts w:ascii="Calibri" w:hAnsi="Calibri" w:eastAsia="Songti SC"/>
+                <w:rFonts w:ascii="Calibri" w:hAnsi="Calibri" w:eastAsia="Hiragino Sans GB"/>
                 <w:b w:val="0"/>
                 <w:color w:val="111827"/>
                 <w:sz w:val="16"/>
               </w:rPr>
-              <w:t>未识别</w:t>
+              <w:t>深研主编</w:t>
             </w:r>
           </w:p>
         </w:tc>
@@ -2667,552 +3321,7 @@
             <w:r/>
             <w:r>
               <w:rPr>
-                <w:rFonts w:ascii="Calibri" w:hAnsi="Calibri" w:eastAsia="Songti SC"/>
-                <w:b w:val="0"/>
-                <w:color w:val="111827"/>
-                <w:sz w:val="16"/>
-              </w:rPr>
-              <w:t>宏观通胀传导</w:t>
-            </w:r>
-          </w:p>
-        </w:tc>
-        <w:tc>
-          <w:tcPr>
-            <w:tcW w:type="dxa" w:w="900"/>
-            <w:vAlign w:val="center"/>
-          </w:tcPr>
-          <w:p>
-            <w:pPr>
-              <w:spacing w:before="0" w:after="0"/>
-              <w:jc w:val="center"/>
-            </w:pPr>
-            <w:r/>
-            <w:r>
-              <w:rPr>
-                <w:rFonts w:ascii="Calibri" w:hAnsi="Calibri" w:eastAsia="Songti SC"/>
-                <w:b/>
-                <w:color w:val="111827"/>
-                <w:sz w:val="17"/>
-              </w:rPr>
-              <w:t>38.4</w:t>
-            </w:r>
-          </w:p>
-        </w:tc>
-        <w:tc>
-          <w:tcPr>
-            <w:tcW w:type="dxa" w:w="1500"/>
-            <w:vAlign w:val="center"/>
-          </w:tcPr>
-          <w:p>
-            <w:pPr>
-              <w:spacing w:before="0" w:after="0"/>
-              <w:jc w:val="center"/>
-            </w:pPr>
-            <w:r/>
-            <w:r>
-              <w:rPr>
-                <w:rFonts w:ascii="Calibri" w:hAnsi="Calibri" w:eastAsia="Songti SC"/>
-                <w:b w:val="0"/>
-                <w:color w:val="111827"/>
-                <w:sz w:val="16"/>
-              </w:rPr>
-              <w:t>常规</w:t>
-            </w:r>
-          </w:p>
-        </w:tc>
-      </w:tr>
-      <w:tr>
-        <w:tc>
-          <w:tcPr>
-            <w:tcW w:type="dxa" w:w="3720"/>
-            <w:vAlign w:val="center"/>
-          </w:tcPr>
-          <w:p>
-            <w:pPr>
-              <w:spacing w:before="0" w:after="0"/>
-            </w:pPr>
-            <w:r/>
-            <w:r>
-              <w:rPr>
-                <w:rFonts w:ascii="Calibri" w:hAnsi="Calibri" w:eastAsia="Songti SC"/>
-                <w:b w:val="0"/>
-                <w:color w:val="111827"/>
-                <w:sz w:val="17"/>
-              </w:rPr>
-              <w:t>极度牛平与久期反转情景下的多资产风险平价重塑与套保优化 — 2026-07-10</w:t>
-            </w:r>
-          </w:p>
-        </w:tc>
-        <w:tc>
-          <w:tcPr>
-            <w:tcW w:type="dxa" w:w="1560"/>
-            <w:vAlign w:val="center"/>
-          </w:tcPr>
-          <w:p>
-            <w:pPr>
-              <w:spacing w:before="0" w:after="0"/>
-            </w:pPr>
-            <w:r/>
-            <w:r>
-              <w:rPr>
-                <w:rFonts w:ascii="Calibri" w:hAnsi="Calibri" w:eastAsia="Songti SC"/>
-                <w:b w:val="0"/>
-                <w:color w:val="111827"/>
-                <w:sz w:val="16"/>
-              </w:rPr>
-              <w:t>未识别</w:t>
-            </w:r>
-          </w:p>
-        </w:tc>
-        <w:tc>
-          <w:tcPr>
-            <w:tcW w:type="dxa" w:w="1680"/>
-            <w:vAlign w:val="center"/>
-          </w:tcPr>
-          <w:p>
-            <w:pPr>
-              <w:spacing w:before="0" w:after="0"/>
-            </w:pPr>
-            <w:r/>
-            <w:r>
-              <w:rPr>
-                <w:rFonts w:ascii="Calibri" w:hAnsi="Calibri" w:eastAsia="Songti SC"/>
-                <w:b w:val="0"/>
-                <w:color w:val="111827"/>
-                <w:sz w:val="16"/>
-              </w:rPr>
-              <w:t>宏观通胀传导</w:t>
-            </w:r>
-          </w:p>
-        </w:tc>
-        <w:tc>
-          <w:tcPr>
-            <w:tcW w:type="dxa" w:w="900"/>
-            <w:vAlign w:val="center"/>
-          </w:tcPr>
-          <w:p>
-            <w:pPr>
-              <w:spacing w:before="0" w:after="0"/>
-              <w:jc w:val="center"/>
-            </w:pPr>
-            <w:r/>
-            <w:r>
-              <w:rPr>
-                <w:rFonts w:ascii="Calibri" w:hAnsi="Calibri" w:eastAsia="Songti SC"/>
-                <w:b/>
-                <w:color w:val="111827"/>
-                <w:sz w:val="17"/>
-              </w:rPr>
-              <w:t>37.6</w:t>
-            </w:r>
-          </w:p>
-        </w:tc>
-        <w:tc>
-          <w:tcPr>
-            <w:tcW w:type="dxa" w:w="1500"/>
-            <w:vAlign w:val="center"/>
-          </w:tcPr>
-          <w:p>
-            <w:pPr>
-              <w:spacing w:before="0" w:after="0"/>
-              <w:jc w:val="center"/>
-            </w:pPr>
-            <w:r/>
-            <w:r>
-              <w:rPr>
-                <w:rFonts w:ascii="Calibri" w:hAnsi="Calibri" w:eastAsia="Songti SC"/>
-                <w:b w:val="0"/>
-                <w:color w:val="111827"/>
-                <w:sz w:val="16"/>
-              </w:rPr>
-              <w:t>风险 1</w:t>
-            </w:r>
-          </w:p>
-        </w:tc>
-      </w:tr>
-      <w:tr>
-        <w:tc>
-          <w:tcPr>
-            <w:tcW w:type="dxa" w:w="3720"/>
-            <w:vAlign w:val="center"/>
-          </w:tcPr>
-          <w:p>
-            <w:pPr>
-              <w:spacing w:before="0" w:after="0"/>
-            </w:pPr>
-            <w:r/>
-            <w:r>
-              <w:rPr>
-                <w:rFonts w:ascii="Calibri" w:hAnsi="Calibri" w:eastAsia="Songti SC"/>
-                <w:b w:val="0"/>
-                <w:color w:val="111827"/>
-                <w:sz w:val="17"/>
-              </w:rPr>
-              <w:t>全球宏观研究报告：美联储鹰派路径下的美日/美德利差与全球套利交易压力测试</w:t>
-            </w:r>
-          </w:p>
-        </w:tc>
-        <w:tc>
-          <w:tcPr>
-            <w:tcW w:type="dxa" w:w="1560"/>
-            <w:vAlign w:val="center"/>
-          </w:tcPr>
-          <w:p>
-            <w:pPr>
-              <w:spacing w:before="0" w:after="0"/>
-            </w:pPr>
-            <w:r/>
-            <w:r>
-              <w:rPr>
-                <w:rFonts w:ascii="Calibri" w:hAnsi="Calibri" w:eastAsia="Songti SC"/>
-                <w:b w:val="0"/>
-                <w:color w:val="111827"/>
-                <w:sz w:val="16"/>
-              </w:rPr>
-              <w:t>未识别</w:t>
-            </w:r>
-          </w:p>
-        </w:tc>
-        <w:tc>
-          <w:tcPr>
-            <w:tcW w:type="dxa" w:w="1680"/>
-            <w:vAlign w:val="center"/>
-          </w:tcPr>
-          <w:p>
-            <w:pPr>
-              <w:spacing w:before="0" w:after="0"/>
-            </w:pPr>
-            <w:r/>
-            <w:r>
-              <w:rPr>
-                <w:rFonts w:ascii="Calibri" w:hAnsi="Calibri" w:eastAsia="Songti SC"/>
-                <w:b w:val="0"/>
-                <w:color w:val="111827"/>
-                <w:sz w:val="16"/>
-              </w:rPr>
-              <w:t>宏观通胀传导</w:t>
-            </w:r>
-          </w:p>
-        </w:tc>
-        <w:tc>
-          <w:tcPr>
-            <w:tcW w:type="dxa" w:w="900"/>
-            <w:vAlign w:val="center"/>
-          </w:tcPr>
-          <w:p>
-            <w:pPr>
-              <w:spacing w:before="0" w:after="0"/>
-              <w:jc w:val="center"/>
-            </w:pPr>
-            <w:r/>
-            <w:r>
-              <w:rPr>
-                <w:rFonts w:ascii="Calibri" w:hAnsi="Calibri" w:eastAsia="Songti SC"/>
-                <w:b/>
-                <w:color w:val="111827"/>
-                <w:sz w:val="17"/>
-              </w:rPr>
-              <w:t>37.5</w:t>
-            </w:r>
-          </w:p>
-        </w:tc>
-        <w:tc>
-          <w:tcPr>
-            <w:tcW w:type="dxa" w:w="1500"/>
-            <w:vAlign w:val="center"/>
-          </w:tcPr>
-          <w:p>
-            <w:pPr>
-              <w:spacing w:before="0" w:after="0"/>
-              <w:jc w:val="center"/>
-            </w:pPr>
-            <w:r/>
-            <w:r>
-              <w:rPr>
-                <w:rFonts w:ascii="Calibri" w:hAnsi="Calibri" w:eastAsia="Songti SC"/>
-                <w:b w:val="0"/>
-                <w:color w:val="111827"/>
-                <w:sz w:val="16"/>
-              </w:rPr>
-              <w:t>风险 1</w:t>
-            </w:r>
-          </w:p>
-        </w:tc>
-      </w:tr>
-      <w:tr>
-        <w:tc>
-          <w:tcPr>
-            <w:tcW w:type="dxa" w:w="3720"/>
-            <w:vAlign w:val="center"/>
-          </w:tcPr>
-          <w:p>
-            <w:pPr>
-              <w:spacing w:before="0" w:after="0"/>
-            </w:pPr>
-            <w:r/>
-            <w:r>
-              <w:rPr>
-                <w:rFonts w:ascii="Calibri" w:hAnsi="Calibri" w:eastAsia="Songti SC"/>
-                <w:b w:val="0"/>
-                <w:color w:val="111827"/>
-                <w:sz w:val="17"/>
-              </w:rPr>
-              <w:t>2026-07-10最终统一房观：油价冲击、离岸美元与carry尾部</w:t>
-            </w:r>
-          </w:p>
-        </w:tc>
-        <w:tc>
-          <w:tcPr>
-            <w:tcW w:type="dxa" w:w="1560"/>
-            <w:vAlign w:val="center"/>
-          </w:tcPr>
-          <w:p>
-            <w:pPr>
-              <w:spacing w:before="0" w:after="0"/>
-            </w:pPr>
-            <w:r/>
-            <w:r>
-              <w:rPr>
-                <w:rFonts w:ascii="Calibri" w:hAnsi="Calibri" w:eastAsia="Songti SC"/>
-                <w:b w:val="0"/>
-                <w:color w:val="111827"/>
-                <w:sz w:val="16"/>
-              </w:rPr>
-              <w:t>未识别</w:t>
-            </w:r>
-          </w:p>
-        </w:tc>
-        <w:tc>
-          <w:tcPr>
-            <w:tcW w:type="dxa" w:w="1680"/>
-            <w:vAlign w:val="center"/>
-          </w:tcPr>
-          <w:p>
-            <w:pPr>
-              <w:spacing w:before="0" w:after="0"/>
-            </w:pPr>
-            <w:r/>
-            <w:r>
-              <w:rPr>
-                <w:rFonts w:ascii="Calibri" w:hAnsi="Calibri" w:eastAsia="Songti SC"/>
-                <w:b w:val="0"/>
-                <w:color w:val="111827"/>
-                <w:sz w:val="16"/>
-              </w:rPr>
-              <w:t>宏观通胀传导</w:t>
-            </w:r>
-          </w:p>
-        </w:tc>
-        <w:tc>
-          <w:tcPr>
-            <w:tcW w:type="dxa" w:w="900"/>
-            <w:vAlign w:val="center"/>
-          </w:tcPr>
-          <w:p>
-            <w:pPr>
-              <w:spacing w:before="0" w:after="0"/>
-              <w:jc w:val="center"/>
-            </w:pPr>
-            <w:r/>
-            <w:r>
-              <w:rPr>
-                <w:rFonts w:ascii="Calibri" w:hAnsi="Calibri" w:eastAsia="Songti SC"/>
-                <w:b/>
-                <w:color w:val="111827"/>
-                <w:sz w:val="17"/>
-              </w:rPr>
-              <w:t>37.5</w:t>
-            </w:r>
-          </w:p>
-        </w:tc>
-        <w:tc>
-          <w:tcPr>
-            <w:tcW w:type="dxa" w:w="1500"/>
-            <w:vAlign w:val="center"/>
-          </w:tcPr>
-          <w:p>
-            <w:pPr>
-              <w:spacing w:before="0" w:after="0"/>
-              <w:jc w:val="center"/>
-            </w:pPr>
-            <w:r/>
-            <w:r>
-              <w:rPr>
-                <w:rFonts w:ascii="Calibri" w:hAnsi="Calibri" w:eastAsia="Songti SC"/>
-                <w:b w:val="0"/>
-                <w:color w:val="111827"/>
-                <w:sz w:val="16"/>
-              </w:rPr>
-              <w:t>常规</w:t>
-            </w:r>
-          </w:p>
-        </w:tc>
-      </w:tr>
-      <w:tr>
-        <w:tc>
-          <w:tcPr>
-            <w:tcW w:type="dxa" w:w="3720"/>
-            <w:vAlign w:val="center"/>
-          </w:tcPr>
-          <w:p>
-            <w:pPr>
-              <w:spacing w:before="0" w:after="0"/>
-            </w:pPr>
-            <w:r/>
-            <w:r>
-              <w:rPr>
-                <w:rFonts w:ascii="Calibri" w:hAnsi="Calibri" w:eastAsia="Songti SC"/>
-                <w:b w:val="0"/>
-                <w:color w:val="111827"/>
-                <w:sz w:val="17"/>
-              </w:rPr>
-              <w:t>2026-07-10 策略研究记录：39%债券仓位内的久期结构与USD/CNH套保</w:t>
-            </w:r>
-          </w:p>
-        </w:tc>
-        <w:tc>
-          <w:tcPr>
-            <w:tcW w:type="dxa" w:w="1560"/>
-            <w:vAlign w:val="center"/>
-          </w:tcPr>
-          <w:p>
-            <w:pPr>
-              <w:spacing w:before="0" w:after="0"/>
-            </w:pPr>
-            <w:r/>
-            <w:r>
-              <w:rPr>
-                <w:rFonts w:ascii="Calibri" w:hAnsi="Calibri" w:eastAsia="Songti SC"/>
-                <w:b w:val="0"/>
-                <w:color w:val="111827"/>
-                <w:sz w:val="16"/>
-              </w:rPr>
-              <w:t>未识别</w:t>
-            </w:r>
-          </w:p>
-        </w:tc>
-        <w:tc>
-          <w:tcPr>
-            <w:tcW w:type="dxa" w:w="1680"/>
-            <w:vAlign w:val="center"/>
-          </w:tcPr>
-          <w:p>
-            <w:pPr>
-              <w:spacing w:before="0" w:after="0"/>
-            </w:pPr>
-            <w:r/>
-            <w:r>
-              <w:rPr>
-                <w:rFonts w:ascii="Calibri" w:hAnsi="Calibri" w:eastAsia="Songti SC"/>
-                <w:b w:val="0"/>
-                <w:color w:val="111827"/>
-                <w:sz w:val="16"/>
-              </w:rPr>
-              <w:t>宏观通胀传导</w:t>
-            </w:r>
-          </w:p>
-        </w:tc>
-        <w:tc>
-          <w:tcPr>
-            <w:tcW w:type="dxa" w:w="900"/>
-            <w:vAlign w:val="center"/>
-          </w:tcPr>
-          <w:p>
-            <w:pPr>
-              <w:spacing w:before="0" w:after="0"/>
-              <w:jc w:val="center"/>
-            </w:pPr>
-            <w:r/>
-            <w:r>
-              <w:rPr>
-                <w:rFonts w:ascii="Calibri" w:hAnsi="Calibri" w:eastAsia="Songti SC"/>
-                <w:b/>
-                <w:color w:val="111827"/>
-                <w:sz w:val="17"/>
-              </w:rPr>
-              <w:t>35.7</w:t>
-            </w:r>
-          </w:p>
-        </w:tc>
-        <w:tc>
-          <w:tcPr>
-            <w:tcW w:type="dxa" w:w="1500"/>
-            <w:vAlign w:val="center"/>
-          </w:tcPr>
-          <w:p>
-            <w:pPr>
-              <w:spacing w:before="0" w:after="0"/>
-              <w:jc w:val="center"/>
-            </w:pPr>
-            <w:r/>
-            <w:r>
-              <w:rPr>
-                <w:rFonts w:ascii="Calibri" w:hAnsi="Calibri" w:eastAsia="Songti SC"/>
-                <w:b w:val="0"/>
-                <w:color w:val="111827"/>
-                <w:sz w:val="16"/>
-              </w:rPr>
-              <w:t>常规</w:t>
-            </w:r>
-          </w:p>
-        </w:tc>
-      </w:tr>
-      <w:tr>
-        <w:tc>
-          <w:tcPr>
-            <w:tcW w:type="dxa" w:w="3720"/>
-            <w:vAlign w:val="center"/>
-          </w:tcPr>
-          <w:p>
-            <w:pPr>
-              <w:spacing w:before="0" w:after="0"/>
-            </w:pPr>
-            <w:r/>
-            <w:r>
-              <w:rPr>
-                <w:rFonts w:ascii="Calibri" w:hAnsi="Calibri" w:eastAsia="Songti SC"/>
-                <w:b w:val="0"/>
-                <w:color w:val="111827"/>
-                <w:sz w:val="17"/>
-              </w:rPr>
-              <w:t>2026-07-10 首席策略师研究记录：把65/25/10主权债子仓、FX对冲、payer swaption与JPY凸性并入完整...</w:t>
-            </w:r>
-          </w:p>
-        </w:tc>
-        <w:tc>
-          <w:tcPr>
-            <w:tcW w:type="dxa" w:w="1560"/>
-            <w:vAlign w:val="center"/>
-          </w:tcPr>
-          <w:p>
-            <w:pPr>
-              <w:spacing w:before="0" w:after="0"/>
-            </w:pPr>
-            <w:r/>
-            <w:r>
-              <w:rPr>
-                <w:rFonts w:ascii="Calibri" w:hAnsi="Calibri" w:eastAsia="Songti SC"/>
-                <w:b w:val="0"/>
-                <w:color w:val="111827"/>
-                <w:sz w:val="16"/>
-              </w:rPr>
-              <w:t>未识别</w:t>
-            </w:r>
-          </w:p>
-        </w:tc>
-        <w:tc>
-          <w:tcPr>
-            <w:tcW w:type="dxa" w:w="1680"/>
-            <w:vAlign w:val="center"/>
-          </w:tcPr>
-          <w:p>
-            <w:pPr>
-              <w:spacing w:before="0" w:after="0"/>
-            </w:pPr>
-            <w:r/>
-            <w:r>
-              <w:rPr>
-                <w:rFonts w:ascii="Calibri" w:hAnsi="Calibri" w:eastAsia="Songti SC"/>
+                <w:rFonts w:ascii="Calibri" w:hAnsi="Calibri" w:eastAsia="Hiragino Sans GB"/>
                 <w:b w:val="0"/>
                 <w:color w:val="111827"/>
                 <w:sz w:val="16"/>
@@ -3234,12 +3343,12 @@
             <w:r/>
             <w:r>
               <w:rPr>
-                <w:rFonts w:ascii="Calibri" w:hAnsi="Calibri" w:eastAsia="Songti SC"/>
+                <w:rFonts w:ascii="Calibri" w:hAnsi="Calibri" w:eastAsia="Hiragino Sans GB"/>
                 <w:b/>
                 <w:color w:val="111827"/>
                 <w:sz w:val="17"/>
               </w:rPr>
-              <w:t>34.4</w:t>
+              <w:t>40.8</w:t>
             </w:r>
           </w:p>
         </w:tc>
@@ -3256,121 +3365,12 @@
             <w:r/>
             <w:r>
               <w:rPr>
-                <w:rFonts w:ascii="Calibri" w:hAnsi="Calibri" w:eastAsia="Songti SC"/>
+                <w:rFonts w:ascii="Calibri" w:hAnsi="Calibri" w:eastAsia="Hiragino Sans GB"/>
                 <w:b w:val="0"/>
                 <w:color w:val="111827"/>
                 <w:sz w:val="16"/>
               </w:rPr>
               <w:t>风险 1</w:t>
-            </w:r>
-          </w:p>
-        </w:tc>
-      </w:tr>
-      <w:tr>
-        <w:tc>
-          <w:tcPr>
-            <w:tcW w:type="dxa" w:w="3720"/>
-            <w:vAlign w:val="center"/>
-          </w:tcPr>
-          <w:p>
-            <w:pPr>
-              <w:spacing w:before="0" w:after="0"/>
-            </w:pPr>
-            <w:r/>
-            <w:r>
-              <w:rPr>
-                <w:rFonts w:ascii="Calibri" w:hAnsi="Calibri" w:eastAsia="Songti SC"/>
-                <w:b w:val="0"/>
-                <w:color w:val="111827"/>
-                <w:sz w:val="17"/>
-              </w:rPr>
-              <w:t>40/25/25/10 杠铃治理手册发布前 QA 审计</w:t>
-            </w:r>
-          </w:p>
-        </w:tc>
-        <w:tc>
-          <w:tcPr>
-            <w:tcW w:type="dxa" w:w="1560"/>
-            <w:vAlign w:val="center"/>
-          </w:tcPr>
-          <w:p>
-            <w:pPr>
-              <w:spacing w:before="0" w:after="0"/>
-            </w:pPr>
-            <w:r/>
-            <w:r>
-              <w:rPr>
-                <w:rFonts w:ascii="Calibri" w:hAnsi="Calibri" w:eastAsia="Songti SC"/>
-                <w:b w:val="0"/>
-                <w:color w:val="111827"/>
-                <w:sz w:val="16"/>
-              </w:rPr>
-              <w:t>未识别</w:t>
-            </w:r>
-          </w:p>
-        </w:tc>
-        <w:tc>
-          <w:tcPr>
-            <w:tcW w:type="dxa" w:w="1680"/>
-            <w:vAlign w:val="center"/>
-          </w:tcPr>
-          <w:p>
-            <w:pPr>
-              <w:spacing w:before="0" w:after="0"/>
-            </w:pPr>
-            <w:r/>
-            <w:r>
-              <w:rPr>
-                <w:rFonts w:ascii="Calibri" w:hAnsi="Calibri" w:eastAsia="Songti SC"/>
-                <w:b w:val="0"/>
-                <w:color w:val="111827"/>
-                <w:sz w:val="16"/>
-              </w:rPr>
-              <w:t>宏观通胀传导</w:t>
-            </w:r>
-          </w:p>
-        </w:tc>
-        <w:tc>
-          <w:tcPr>
-            <w:tcW w:type="dxa" w:w="900"/>
-            <w:vAlign w:val="center"/>
-          </w:tcPr>
-          <w:p>
-            <w:pPr>
-              <w:spacing w:before="0" w:after="0"/>
-              <w:jc w:val="center"/>
-            </w:pPr>
-            <w:r/>
-            <w:r>
-              <w:rPr>
-                <w:rFonts w:ascii="Calibri" w:hAnsi="Calibri" w:eastAsia="Songti SC"/>
-                <w:b/>
-                <w:color w:val="111827"/>
-                <w:sz w:val="17"/>
-              </w:rPr>
-              <w:t>33.9</w:t>
-            </w:r>
-          </w:p>
-        </w:tc>
-        <w:tc>
-          <w:tcPr>
-            <w:tcW w:type="dxa" w:w="1500"/>
-            <w:vAlign w:val="center"/>
-          </w:tcPr>
-          <w:p>
-            <w:pPr>
-              <w:spacing w:before="0" w:after="0"/>
-              <w:jc w:val="center"/>
-            </w:pPr>
-            <w:r/>
-            <w:r>
-              <w:rPr>
-                <w:rFonts w:ascii="Calibri" w:hAnsi="Calibri" w:eastAsia="Songti SC"/>
-                <w:b w:val="0"/>
-                <w:color w:val="111827"/>
-                <w:sz w:val="16"/>
-              </w:rPr>
-              <w:t>风险 2</w:t>
             </w:r>
           </w:p>
         </w:tc>
@@ -3382,7 +3382,7 @@
       </w:pPr>
       <w:r>
         <w:rPr>
-          <w:rFonts w:ascii="Calibri" w:hAnsi="Calibri" w:eastAsia="Songti SC"/>
+          <w:rFonts w:ascii="Calibri" w:hAnsi="Calibri" w:eastAsia="Hiragino Sans GB"/>
           <w:b w:val="0"/>
           <w:i/>
           <w:color w:val="667085"/>
@@ -3412,7 +3412,7 @@
     </w:pPr>
     <w:r>
       <w:rPr>
-        <w:rFonts w:ascii="Calibri" w:hAnsi="Calibri" w:eastAsia="Songti SC"/>
+        <w:rFonts w:ascii="Calibri" w:hAnsi="Calibri" w:eastAsia="Hiragino Sans GB"/>
         <w:color w:val="667085"/>
         <w:sz w:val="17"/>
       </w:rPr>
@@ -3431,7 +3431,7 @@
     <w:r/>
     <w:r>
       <w:rPr>
-        <w:rFonts w:ascii="Calibri" w:hAnsi="Calibri" w:eastAsia="Songti SC"/>
+        <w:rFonts w:ascii="Calibri" w:hAnsi="Calibri" w:eastAsia="Hiragino Sans GB"/>
         <w:color w:val="667085"/>
         <w:sz w:val="18"/>
       </w:rPr>
@@ -3808,7 +3808,7 @@
       <w:spacing w:after="120" w:line="264" w:lineRule="auto"/>
     </w:pPr>
     <w:rPr>
-      <w:rFonts w:ascii="Calibri" w:hAnsi="Calibri" w:eastAsia="Songti SC"/>
+      <w:rFonts w:ascii="Calibri" w:hAnsi="Calibri" w:eastAsia="Hiragino Sans GB"/>
       <w:b w:val="0"/>
       <w:color w:val="111827"/>
       <w:sz w:val="22"/>
@@ -3873,7 +3873,7 @@
       <w:outlineLvl w:val="0"/>
     </w:pPr>
     <w:rPr>
-      <w:rFonts w:asciiTheme="majorHAnsi" w:eastAsiaTheme="majorEastAsia" w:hAnsiTheme="majorHAnsi" w:cstheme="majorBidi" w:ascii="Calibri" w:hAnsi="Calibri" w:eastAsia="Songti SC"/>
+      <w:rFonts w:asciiTheme="majorHAnsi" w:eastAsiaTheme="majorEastAsia" w:hAnsiTheme="majorHAnsi" w:cstheme="majorBidi" w:ascii="Calibri" w:hAnsi="Calibri" w:eastAsia="Hiragino Sans GB"/>
       <w:b/>
       <w:bCs/>
       <w:color w:val="2E74B5"/>
@@ -3897,7 +3897,7 @@
       <w:outlineLvl w:val="1"/>
     </w:pPr>
     <w:rPr>
-      <w:rFonts w:asciiTheme="majorHAnsi" w:eastAsiaTheme="majorEastAsia" w:hAnsiTheme="majorHAnsi" w:cstheme="majorBidi" w:ascii="Calibri" w:hAnsi="Calibri" w:eastAsia="Songti SC"/>
+      <w:rFonts w:asciiTheme="majorHAnsi" w:eastAsiaTheme="majorEastAsia" w:hAnsiTheme="majorHAnsi" w:cstheme="majorBidi" w:ascii="Calibri" w:hAnsi="Calibri" w:eastAsia="Hiragino Sans GB"/>
       <w:b/>
       <w:bCs/>
       <w:color w:val="2E74B5"/>
@@ -3921,7 +3921,7 @@
       <w:outlineLvl w:val="2"/>
     </w:pPr>
     <w:rPr>
-      <w:rFonts w:asciiTheme="majorHAnsi" w:eastAsiaTheme="majorEastAsia" w:hAnsiTheme="majorHAnsi" w:cstheme="majorBidi" w:ascii="Calibri" w:hAnsi="Calibri" w:eastAsia="Songti SC"/>
+      <w:rFonts w:asciiTheme="majorHAnsi" w:eastAsiaTheme="majorEastAsia" w:hAnsiTheme="majorHAnsi" w:cstheme="majorBidi" w:ascii="Calibri" w:hAnsi="Calibri" w:eastAsia="Hiragino Sans GB"/>
       <w:b/>
       <w:bCs/>
       <w:color w:val="1F4D78"/>
@@ -4163,7 +4163,7 @@
       <w:contextualSpacing/>
     </w:pPr>
     <w:rPr>
-      <w:rFonts w:asciiTheme="majorHAnsi" w:eastAsiaTheme="majorEastAsia" w:hAnsiTheme="majorHAnsi" w:cstheme="majorBidi" w:ascii="Calibri" w:hAnsi="Calibri" w:eastAsia="Songti SC"/>
+      <w:rFonts w:asciiTheme="majorHAnsi" w:eastAsiaTheme="majorEastAsia" w:hAnsiTheme="majorHAnsi" w:cstheme="majorBidi" w:ascii="Calibri" w:hAnsi="Calibri" w:eastAsia="Hiragino Sans GB"/>
       <w:b/>
       <w:color w:val="0B2545"/>
       <w:spacing w:val="5"/>
@@ -4201,7 +4201,7 @@
       </w:numPr>
     </w:pPr>
     <w:rPr>
-      <w:rFonts w:asciiTheme="majorHAnsi" w:eastAsiaTheme="majorEastAsia" w:hAnsiTheme="majorHAnsi" w:cstheme="majorBidi" w:ascii="Calibri" w:hAnsi="Calibri" w:eastAsia="Songti SC"/>
+      <w:rFonts w:asciiTheme="majorHAnsi" w:eastAsiaTheme="majorEastAsia" w:hAnsiTheme="majorHAnsi" w:cstheme="majorBidi" w:ascii="Calibri" w:hAnsi="Calibri" w:eastAsia="Hiragino Sans GB"/>
       <w:b w:val="0"/>
       <w:i/>
       <w:iCs/>

</xml_diff>